<commit_message>
feat: Supervisores multi-select, ingredientes con fabricante/certificacion, firma final en Word
- Supervisores: checklist multi-seleccion + entrada manual, auto-rellena bishulBy y supervisor regular
- Ingredientes: campos fabricante y certificacion, formato vertical en Word (Nombre - Fabricante - Cert)
- Firma certificadora eliminada del formulario (la ponen ellos)
- Firma final agregada al template Word despues del proceso de produccion
- Template Word corregido: duplicado materias_primas eliminado, pais/ciudad separados
- Productos: agregados a formFieldMap, formTitles, formBtnLabels, export/import
- Estilos: .raw-mat-detail para info de fabricante/certificacion
</commit_message>
<xml_diff>
--- a/template.docx
+++ b/template.docx
@@ -758,7 +758,7 @@
           <w:szCs w:val="24"/>
           <w:rtl/>
         </w:rPr>
-        <w:t xml:space="preserve">עיר: </w:t>
+        <w:t xml:space="preserve"> — עיר: </w:t>
       </w:r>
       <w:r>
         <w:rPr>
@@ -2389,7 +2389,7 @@
           <w:szCs w:val="24"/>
           <w:rtl/>
         </w:rPr>
-        <w:t>{materias_primas}</w:t>
+        <w:t/>
       </w:r>
       <w:r>
         <w:rPr>
@@ -2613,94 +2613,129 @@
         <w:spacing w:line="360" w:lineRule="auto"/>
         <w:rPr>
           <w:rFonts w:ascii="David" w:hAnsi="David" w:cs="David"/>
-          <w:b/>
-          <w:bCs/>
-          <w:sz w:val="24"/>
-          <w:szCs w:val="24"/>
-          <w:rtl/>
-        </w:rPr>
-      </w:pPr>
-      <w:r>
-        <w:rPr>
-          <w:rFonts w:ascii="David" w:eastAsia="Arial Unicode MS" w:hAnsi="David" w:cs="David"/>
-          <w:sz w:val="24"/>
-          <w:szCs w:val="24"/>
-          <w:rtl/>
-        </w:rPr>
-        <w:t xml:space="preserve">חתימת המשגיח: </w:t>
-      </w:r>
-      <w:r>
-        <w:rPr>
-          <w:rFonts w:ascii="David" w:eastAsia="Arial Unicode MS" w:hAnsi="David" w:cs="David" w:hint="cs"/>
+          <w:sz w:val="24"/>
+          <w:szCs w:val="24"/>
+          <w:rtl/>
+        </w:rPr>
+      </w:pPr>
+      <w:r>
+        <w:rPr>
+          <w:rFonts w:ascii="David" w:hAnsi="David" w:cs="David" w:hint="cs"/>
           <w:sz w:val="24"/>
           <w:szCs w:val="24"/>
           <w:rtl/>
         </w:rPr>
         <w:t>{proceso_produccion}</w:t>
       </w:r>
-      <w:r>
+    </w:p>
+    <w:p>
+      <w:pPr>
+        <w:bidi/>
+        <w:spacing w:line="360" w:lineRule="auto"/>
+      </w:pPr>
+    </w:p>
+    <w:p>
+      <w:pPr>
+        <w:bidi/>
+        <w:spacing w:line="360" w:lineRule="auto"/>
+        <w:jc w:val="right"/>
         <w:rPr>
           <w:rFonts w:ascii="David" w:hAnsi="David" w:cs="David"/>
-          <w:sz w:val="24"/>
-          <w:szCs w:val="24"/>
-          <w:rtl/>
-        </w:rPr>
-        <w:br/>
-      </w:r>
+          <w:b/>
+          <w:bCs/>
+          <w:sz w:val="28"/>
+          <w:szCs w:val="28"/>
+          <w:rtl/>
+        </w:rPr>
+      </w:pPr>
       <w:r>
         <w:rPr>
           <w:rFonts w:ascii="David" w:hAnsi="David" w:cs="David" w:hint="cs"/>
-          <w:sz w:val="24"/>
-          <w:szCs w:val="24"/>
-          <w:rtl/>
-        </w:rPr>
-        <w:t xml:space="preserve">תאריך : </w:t>
-      </w:r>
-      <w:r>
-        <w:rPr>
-          <w:rFonts w:ascii="David" w:eastAsia="Arial Unicode MS" w:hAnsi="David" w:cs="David" w:hint="cs"/>
-          <w:sz w:val="24"/>
-          <w:szCs w:val="24"/>
-          <w:rtl/>
-        </w:rPr>
-        <w:t>{proceso_produccion_2}</w:t>
-      </w:r>
-      <w:r>
+          <w:b/>
+          <w:bCs/>
+          <w:sz w:val="28"/>
+          <w:szCs w:val="28"/>
+          <w:rtl/>
+        </w:rPr>
+        <w:t>חתימה סופית</w:t>
+      </w:r>
+    </w:p>
+    <w:p>
+      <w:pPr>
+        <w:bidi/>
+        <w:spacing w:line="360" w:lineRule="auto"/>
+        <w:jc w:val="right"/>
         <w:rPr>
           <w:rFonts w:ascii="David" w:hAnsi="David" w:cs="David"/>
-          <w:b/>
-          <w:bCs/>
-          <w:sz w:val="24"/>
-          <w:szCs w:val="24"/>
-          <w:rtl/>
-        </w:rPr>
-        <w:softHyphen/>
-      </w:r>
+          <w:sz w:val="24"/>
+          <w:szCs w:val="24"/>
+          <w:rtl/>
+        </w:rPr>
+      </w:pPr>
+      <w:r>
+        <w:rPr>
+          <w:rFonts w:ascii="David" w:hAnsi="David" w:cs="David" w:hint="cs"/>
+          <w:sz w:val="24"/>
+          <w:szCs w:val="24"/>
+          <w:rtl/>
+        </w:rPr>
+        <w:t>חתימת המשגיח:</w:t>
+      </w:r>
+    </w:p>
+    <w:p>
+      <w:pPr>
+        <w:bidi/>
+        <w:spacing w:line="360" w:lineRule="auto"/>
+        <w:jc w:val="right"/>
+      </w:pPr>
       <w:r>
         <w:rPr>
           <w:rFonts w:ascii="David" w:hAnsi="David" w:cs="David"/>
-          <w:b/>
-          <w:bCs/>
-          <w:sz w:val="24"/>
-          <w:szCs w:val="24"/>
-          <w:rtl/>
-        </w:rPr>
-        <w:softHyphen/>
+          <w:sz w:val="24"/>
+          <w:szCs w:val="24"/>
+        </w:rPr>
+        <w:t>{%firma_final}</w:t>
       </w:r>
     </w:p>
     <w:p>
       <w:pPr>
         <w:bidi/>
         <w:spacing w:line="360" w:lineRule="auto"/>
+        <w:jc w:val="right"/>
         <w:rPr>
           <w:rFonts w:ascii="David" w:hAnsi="David" w:cs="David"/>
-          <w:b/>
-          <w:bCs/>
-          <w:sz w:val="24"/>
-          <w:szCs w:val="24"/>
-          <w:rtl/>
-        </w:rPr>
-      </w:pPr>
+          <w:sz w:val="24"/>
+          <w:szCs w:val="24"/>
+          <w:rtl/>
+        </w:rPr>
+      </w:pPr>
+      <w:r>
+        <w:rPr>
+          <w:rFonts w:ascii="David" w:hAnsi="David" w:cs="David" w:hint="cs"/>
+          <w:sz w:val="24"/>
+          <w:szCs w:val="24"/>
+          <w:rtl/>
+        </w:rPr>
+        <w:t>תאריך: {fecha_final}</w:t>
+      </w:r>
+    </w:p>
+    <w:p>
+      <w:pPr>
+        <w:bidi/>
+        <w:spacing w:line="360" w:lineRule="auto"/>
+        <w:jc w:val="right"/>
+      </w:pPr>
+      <w:r>
+        <w:rPr>
+          <w:rFonts w:ascii="David" w:hAnsi="David" w:cs="David" w:hint="cs"/>
+          <w:i/>
+          <w:iCs/>
+          <w:sz w:val="22"/>
+          <w:szCs w:val="22"/>
+          <w:rtl/>
+        </w:rPr>
+        <w:t>(זו חתימתי והנתונים שמסרתי הינם נכונים ומדויקים.)</w:t>
+      </w:r>
     </w:p>
     <w:sectPr>
       <w:headerReference w:type="default" r:id="rId7"/>

</xml_diff>

<commit_message>
fix: Productos no se guardaban - faltaba 'products' en validTypes del servidor
- Agregado 'products' a masterData initialization
- Agregado fallback if (!masterData.products) al cargar data.json
- Agregado 'products' a validTypes en POST, PUT, DELETE endpoints
- Agregado 'products' a PUT /api/data (import)
- Fix XML template: párrafo duplicado <w:p><w:p> corregido
- Fix post-procesamiento: reemplazado regex lento con split() para evitar backtracking
</commit_message>
<xml_diff>
--- a/template.docx
+++ b/template.docx
@@ -2632,6 +2632,12 @@
       <w:pPr>
         <w:bidi/>
         <w:spacing w:line="360" w:lineRule="auto"/>
+        <w:rPr>
+          <w:rFonts w:ascii="David" w:hAnsi="David" w:cs="David"/>
+          <w:sz w:val="24"/>
+          <w:szCs w:val="24"/>
+          <w:rtl/>
+        </w:rPr>
       </w:pPr>
     </w:p>
     <w:p>
@@ -2643,8 +2649,8 @@
           <w:rFonts w:ascii="David" w:hAnsi="David" w:cs="David"/>
           <w:b/>
           <w:bCs/>
-          <w:sz w:val="28"/>
-          <w:szCs w:val="28"/>
+          <w:sz w:val="24"/>
+          <w:szCs w:val="24"/>
           <w:rtl/>
         </w:rPr>
       </w:pPr>
@@ -2653,11 +2659,11 @@
           <w:rFonts w:ascii="David" w:hAnsi="David" w:cs="David" w:hint="cs"/>
           <w:b/>
           <w:bCs/>
-          <w:sz w:val="28"/>
-          <w:szCs w:val="28"/>
-          <w:rtl/>
-        </w:rPr>
-        <w:t>חתימה סופית</w:t>
+          <w:sz w:val="24"/>
+          <w:szCs w:val="24"/>
+          <w:rtl/>
+        </w:rPr>
+        <w:t xml:space="preserve">חתימה סופית</w:t>
       </w:r>
     </w:p>
     <w:p>
@@ -2679,7 +2685,7 @@
           <w:szCs w:val="24"/>
           <w:rtl/>
         </w:rPr>
-        <w:t>חתימת המשגיח:</w:t>
+        <w:t xml:space="preserve">חתימת המשגיח:</w:t>
       </w:r>
     </w:p>
     <w:p>
@@ -2687,12 +2693,19 @@
         <w:bidi/>
         <w:spacing w:line="360" w:lineRule="auto"/>
         <w:jc w:val="right"/>
-      </w:pPr>
-      <w:r>
         <w:rPr>
           <w:rFonts w:ascii="David" w:hAnsi="David" w:cs="David"/>
           <w:sz w:val="24"/>
           <w:szCs w:val="24"/>
+          <w:rtl/>
+        </w:rPr>
+      </w:pPr>
+      <w:r>
+        <w:rPr>
+          <w:rFonts w:ascii="David" w:hAnsi="David" w:cs="David" w:hint="cs"/>
+          <w:sz w:val="24"/>
+          <w:szCs w:val="24"/>
+          <w:rtl/>
         </w:rPr>
         <w:t>{%firma_final}</w:t>
       </w:r>
@@ -2701,6 +2714,18 @@
       <w:pPr>
         <w:bidi/>
         <w:spacing w:line="360" w:lineRule="auto"/>
+        <w:rPr>
+          <w:rFonts w:ascii="David" w:hAnsi="David" w:cs="David"/>
+          <w:sz w:val="24"/>
+          <w:szCs w:val="24"/>
+          <w:rtl/>
+        </w:rPr>
+      </w:pPr>
+    </w:p>
+    <w:p>
+      <w:pPr>
+        <w:bidi/>
+        <w:spacing w:line="360" w:lineRule="auto"/>
         <w:jc w:val="right"/>
         <w:rPr>
           <w:rFonts w:ascii="David" w:hAnsi="David" w:cs="David"/>
@@ -2716,7 +2741,7 @@
           <w:szCs w:val="24"/>
           <w:rtl/>
         </w:rPr>
-        <w:t>תאריך: {fecha_final}</w:t>
+        <w:t xml:space="preserve">תאריך: {fecha_final}</w:t>
       </w:r>
     </w:p>
     <w:p>
@@ -2724,27 +2749,23 @@
         <w:bidi/>
         <w:spacing w:line="360" w:lineRule="auto"/>
         <w:jc w:val="right"/>
+        <w:rPr>
+          <w:rFonts w:ascii="David" w:hAnsi="David" w:cs="David"/>
+          <w:sz w:val="24"/>
+          <w:szCs w:val="24"/>
+          <w:rtl/>
+        </w:rPr>
       </w:pPr>
       <w:r>
         <w:rPr>
           <w:rFonts w:ascii="David" w:hAnsi="David" w:cs="David" w:hint="cs"/>
-          <w:i/>
-          <w:iCs/>
-          <w:sz w:val="22"/>
-          <w:szCs w:val="22"/>
-          <w:rtl/>
-        </w:rPr>
-        <w:t>(זו חתימתי והנתונים שמסרתי הינם נכונים ומדויקים.)</w:t>
-      </w:r>
-    </w:p>
-    <w:sectPr>
-      <w:headerReference w:type="default" r:id="rId7"/>
-      <w:footerReference w:type="default" r:id="rId8"/>
-      <w:pgSz w:w="11907" w:h="16839" w:code="9"/>
-      <w:pgMar w:top="1440" w:right="1440" w:bottom="1440" w:left="1440" w:header="708" w:footer="708" w:gutter="0"/>
-      <w:cols w:space="708"/>
-      <w:docGrid w:linePitch="360"/>
-    </w:sectPr>
+          <w:sz w:val="24"/>
+          <w:szCs w:val="24"/>
+          <w:rtl/>
+        </w:rPr>
+        <w:t xml:space="preserve">(זו חתימתי והנתונים שמסרתי הינם נכונים ומדויקים.)</w:t>
+      </w:r>
+    </w:p>
   </w:body>
 </w:document>
 </file>

</xml_diff>

<commit_message>
fix: Restaurar checkboxes de ingredientes, productos y supervisores al cargar reporte
- Raw materials: se dividían por coma pero se guardaban por newline, ahora se extraen los nombres correctamente
- Products: se agregan checkboxes marcados al cargar reporte guardado
- Supervisors: se agregan checkboxes marcados al cargar reporte
- Template: agregado pStyle a9 a párrafos de sección final para alineación RTL correcta
</commit_message>
<xml_diff>
--- a/template.docx
+++ b/template.docx
@@ -2609,6 +2609,7 @@
     </w:p>
     <w:p>
       <w:pPr>
+        <w:pStyle w:val="a9"/>
         <w:bidi/>
         <w:spacing w:line="360" w:lineRule="auto"/>
         <w:rPr>
@@ -2642,6 +2643,7 @@
     </w:p>
     <w:p>
       <w:pPr>
+        <w:pStyle w:val="a9"/>
         <w:bidi/>
         <w:spacing w:line="360" w:lineRule="auto"/>
         <w:jc w:val="right"/>
@@ -2668,6 +2670,7 @@
     </w:p>
     <w:p>
       <w:pPr>
+        <w:pStyle w:val="a9"/>
         <w:bidi/>
         <w:spacing w:line="360" w:lineRule="auto"/>
         <w:jc w:val="right"/>
@@ -2690,6 +2693,7 @@
     </w:p>
     <w:p>
       <w:pPr>
+        <w:pStyle w:val="a9"/>
         <w:bidi/>
         <w:spacing w:line="360" w:lineRule="auto"/>
         <w:jc w:val="right"/>
@@ -2712,6 +2716,7 @@
     </w:p>
     <w:p>
       <w:pPr>
+        <w:pStyle w:val="a9"/>
         <w:bidi/>
         <w:spacing w:line="360" w:lineRule="auto"/>
         <w:rPr>
@@ -2724,6 +2729,7 @@
     </w:p>
     <w:p>
       <w:pPr>
+        <w:pStyle w:val="a9"/>
         <w:bidi/>
         <w:spacing w:line="360" w:lineRule="auto"/>
         <w:jc w:val="right"/>
@@ -2746,6 +2752,7 @@
     </w:p>
     <w:p>
       <w:pPr>
+        <w:pStyle w:val="a9"/>
         <w:bidi/>
         <w:spacing w:line="360" w:lineRule="auto"/>
         <w:jc w:val="right"/>

</xml_diff>

<commit_message>
fix: Agregar pStyle a9 a todos los parrafos del template sin estilo
- 9 parrafos del template no tenian pStyle a9, causando que se rendericen a la izquierda
- Afectaba: titulo, fecha, firma mashgiaj, declaracion, proceso produccion, afiyat israel
- Ahora todos los parrafos heredan las propiedades RTL del estilo a9
</commit_message>
<xml_diff>
--- a/template.docx
+++ b/template.docx
@@ -18,6 +18,7 @@
     </w:p>
     <w:p>
       <w:pPr>
+        <w:pStyle w:val="a9"/>
         <w:bidi/>
         <w:spacing w:after="0" w:line="240" w:lineRule="auto"/>
         <w:rPr>
@@ -38,6 +39,7 @@
     </w:p>
     <w:p>
       <w:pPr>
+        <w:pStyle w:val="a9"/>
         <w:spacing w:after="0" w:line="240" w:lineRule="auto"/>
         <w:jc w:val="center"/>
         <w:rPr>
@@ -95,6 +97,7 @@
     </w:p>
     <w:p>
       <w:pPr>
+        <w:pStyle w:val="a9"/>
         <w:spacing w:after="0" w:line="240" w:lineRule="auto"/>
         <w:jc w:val="center"/>
         <w:rPr>
@@ -145,6 +148,7 @@
     </w:p>
     <w:p>
       <w:pPr>
+        <w:pStyle w:val="a9"/>
         <w:spacing w:line="360" w:lineRule="auto"/>
         <w:rPr>
           <w:rFonts w:ascii="David" w:eastAsia="Arial Unicode MS" w:hAnsi="David" w:cs="David"/>
@@ -1220,6 +1224,7 @@
     </w:p>
     <w:p>
       <w:pPr>
+        <w:pStyle w:val="a9"/>
         <w:bidi/>
         <w:spacing w:line="360" w:lineRule="auto"/>
         <w:rPr>
@@ -1246,6 +1251,7 @@
     </w:p>
     <w:p>
       <w:pPr>
+        <w:pStyle w:val="a9"/>
         <w:bidi/>
         <w:spacing w:line="360" w:lineRule="auto"/>
         <w:rPr>
@@ -2354,6 +2360,7 @@
     </w:p>
     <w:p>
       <w:pPr>
+        <w:pStyle w:val="a9"/>
         <w:bidi/>
         <w:spacing w:line="360" w:lineRule="auto"/>
         <w:rPr>
@@ -2466,6 +2473,7 @@
     </w:p>
     <w:p>
       <w:pPr>
+        <w:pStyle w:val="a9"/>
         <w:bidi/>
         <w:spacing w:line="360" w:lineRule="auto"/>
         <w:rPr>
@@ -2537,6 +2545,7 @@
     </w:p>
     <w:p>
       <w:pPr>
+        <w:pStyle w:val="a9"/>
         <w:spacing w:line="360" w:lineRule="auto"/>
         <w:jc w:val="right"/>
         <w:rPr>

</xml_diff>

<commit_message>
fix: Alineacion completa RTL - firmas e imagenes a la derecha
- Template: todos los parrafos ahora usan pStyle a9 (hereda bidi del estilo)
- Template: removido bidi y jc explicito de parrafos de texto (redundante con pStyle)
- Server: post-procesamiento remueve pStyle de parrafos con imagenes para evitar bidi heredado
- Server: imagenes se alinean con jc=right puro (sin bidi) para posicion fisica derecha
- Resultado: texto hebreo y firmas ambos alineados a la derecha
</commit_message>
<xml_diff>
--- a/template.docx
+++ b/template.docx
@@ -4,7 +4,6 @@
   <w:body>
     <w:p>
       <w:pPr>
-        <w:bidi/>
         <w:spacing w:after="0" w:line="240" w:lineRule="auto"/>
         <w:rPr>
           <w:rFonts w:ascii="David" w:hAnsi="David" w:cs="David"/>
@@ -19,7 +18,6 @@
     <w:p>
       <w:pPr>
         <w:pStyle w:val="a9"/>
-        <w:bidi/>
         <w:spacing w:after="0" w:line="240" w:lineRule="auto"/>
         <w:rPr>
           <w:rFonts w:ascii="David" w:eastAsia="Arial Unicode MS" w:hAnsi="David" w:cs="David"/>
@@ -1225,7 +1223,6 @@
     <w:p>
       <w:pPr>
         <w:pStyle w:val="a9"/>
-        <w:bidi/>
         <w:spacing w:line="360" w:lineRule="auto"/>
         <w:rPr>
           <w:rFonts w:ascii="David" w:eastAsia="Arial Unicode MS" w:hAnsi="David" w:cs="David"/>
@@ -1252,7 +1249,6 @@
     <w:p>
       <w:pPr>
         <w:pStyle w:val="a9"/>
-        <w:bidi/>
         <w:spacing w:line="360" w:lineRule="auto"/>
         <w:rPr>
           <w:rFonts w:ascii="David" w:eastAsia="Arial Unicode MS" w:hAnsi="David" w:cs="David"/>
@@ -2361,7 +2357,6 @@
     <w:p>
       <w:pPr>
         <w:pStyle w:val="a9"/>
-        <w:bidi/>
         <w:spacing w:line="360" w:lineRule="auto"/>
         <w:rPr>
           <w:rFonts w:ascii="David" w:eastAsia="Arial Unicode MS" w:hAnsi="David" w:cs="David"/>
@@ -2474,7 +2469,6 @@
     <w:p>
       <w:pPr>
         <w:pStyle w:val="a9"/>
-        <w:bidi/>
         <w:spacing w:line="360" w:lineRule="auto"/>
         <w:rPr>
           <w:rFonts w:ascii="David" w:eastAsia="Arial Unicode MS" w:hAnsi="David" w:cs="David"/>
@@ -2514,7 +2508,6 @@
     <w:p>
       <w:pPr>
         <w:spacing w:line="360" w:lineRule="auto"/>
-        <w:jc w:val="right"/>
         <w:rPr>
           <w:rFonts w:ascii="David" w:hAnsi="David" w:cs="David"/>
           <w:sz w:val="24"/>
@@ -2535,7 +2528,6 @@
     <w:p>
       <w:pPr>
         <w:spacing w:line="360" w:lineRule="auto"/>
-        <w:jc w:val="right"/>
         <w:rPr>
           <w:rFonts w:ascii="David" w:hAnsi="David" w:cs="David"/>
           <w:sz w:val="24"/>
@@ -2547,7 +2539,6 @@
       <w:pPr>
         <w:pStyle w:val="a9"/>
         <w:spacing w:line="360" w:lineRule="auto"/>
-        <w:jc w:val="right"/>
         <w:rPr>
           <w:rFonts w:ascii="David" w:eastAsia="Arial Unicode MS" w:hAnsi="David" w:cs="David"/>
           <w:sz w:val="24"/>
@@ -2585,41 +2576,37 @@
     <w:p>
       <w:pPr>
         <w:spacing w:line="360" w:lineRule="auto"/>
-        <w:jc w:val="right"/>
-        <w:rPr>
-          <w:rFonts w:ascii="David" w:eastAsia="Arial Unicode MS" w:hAnsi="David" w:cs="David"/>
-          <w:sz w:val="24"/>
-          <w:szCs w:val="24"/>
-        </w:rPr>
-      </w:pPr>
-    </w:p>
-    <w:p>
-      <w:pPr>
-        <w:spacing w:line="360" w:lineRule="auto"/>
-        <w:jc w:val="right"/>
-        <w:rPr>
-          <w:rFonts w:ascii="David" w:eastAsia="Arial Unicode MS" w:hAnsi="David" w:cs="David"/>
-          <w:sz w:val="24"/>
-          <w:szCs w:val="24"/>
-        </w:rPr>
-      </w:pPr>
-    </w:p>
-    <w:p>
-      <w:pPr>
-        <w:spacing w:line="360" w:lineRule="auto"/>
-        <w:jc w:val="right"/>
-        <w:rPr>
-          <w:rFonts w:ascii="David" w:eastAsia="Arial Unicode MS" w:hAnsi="David" w:cs="David"/>
-          <w:sz w:val="24"/>
-          <w:szCs w:val="24"/>
-          <w:rtl/>
-        </w:rPr>
-      </w:pPr>
-    </w:p>
-    <w:p>
-      <w:pPr>
-        <w:pStyle w:val="a9"/>
-        <w:bidi/>
+        <w:rPr>
+          <w:rFonts w:ascii="David" w:eastAsia="Arial Unicode MS" w:hAnsi="David" w:cs="David"/>
+          <w:sz w:val="24"/>
+          <w:szCs w:val="24"/>
+        </w:rPr>
+      </w:pPr>
+    </w:p>
+    <w:p>
+      <w:pPr>
+        <w:spacing w:line="360" w:lineRule="auto"/>
+        <w:rPr>
+          <w:rFonts w:ascii="David" w:eastAsia="Arial Unicode MS" w:hAnsi="David" w:cs="David"/>
+          <w:sz w:val="24"/>
+          <w:szCs w:val="24"/>
+        </w:rPr>
+      </w:pPr>
+    </w:p>
+    <w:p>
+      <w:pPr>
+        <w:spacing w:line="360" w:lineRule="auto"/>
+        <w:rPr>
+          <w:rFonts w:ascii="David" w:eastAsia="Arial Unicode MS" w:hAnsi="David" w:cs="David"/>
+          <w:sz w:val="24"/>
+          <w:szCs w:val="24"/>
+          <w:rtl/>
+        </w:rPr>
+      </w:pPr>
+    </w:p>
+    <w:p>
+      <w:pPr>
+        <w:pStyle w:val="a9"/>
         <w:spacing w:line="360" w:lineRule="auto"/>
         <w:rPr>
           <w:rFonts w:ascii="David" w:hAnsi="David" w:cs="David"/>
@@ -2640,7 +2627,6 @@
     </w:p>
     <w:p>
       <w:pPr>
-        <w:bidi/>
         <w:spacing w:line="360" w:lineRule="auto"/>
         <w:rPr>
           <w:rFonts w:ascii="David" w:hAnsi="David" w:cs="David"/>
@@ -2653,9 +2639,7 @@
     <w:p>
       <w:pPr>
         <w:pStyle w:val="a9"/>
-        <w:bidi/>
-        <w:spacing w:line="360" w:lineRule="auto"/>
-        <w:jc w:val="right"/>
+        <w:spacing w:line="360" w:lineRule="auto"/>
         <w:rPr>
           <w:rFonts w:ascii="David" w:hAnsi="David" w:cs="David"/>
           <w:b/>
@@ -2680,9 +2664,7 @@
     <w:p>
       <w:pPr>
         <w:pStyle w:val="a9"/>
-        <w:bidi/>
-        <w:spacing w:line="360" w:lineRule="auto"/>
-        <w:jc w:val="right"/>
+        <w:spacing w:line="360" w:lineRule="auto"/>
         <w:rPr>
           <w:rFonts w:ascii="David" w:hAnsi="David" w:cs="David"/>
           <w:sz w:val="24"/>
@@ -2703,9 +2685,7 @@
     <w:p>
       <w:pPr>
         <w:pStyle w:val="a9"/>
-        <w:bidi/>
-        <w:spacing w:line="360" w:lineRule="auto"/>
-        <w:jc w:val="right"/>
+        <w:spacing w:line="360" w:lineRule="auto"/>
         <w:rPr>
           <w:rFonts w:ascii="David" w:hAnsi="David" w:cs="David"/>
           <w:sz w:val="24"/>
@@ -2726,7 +2706,6 @@
     <w:p>
       <w:pPr>
         <w:pStyle w:val="a9"/>
-        <w:bidi/>
         <w:spacing w:line="360" w:lineRule="auto"/>
         <w:rPr>
           <w:rFonts w:ascii="David" w:hAnsi="David" w:cs="David"/>
@@ -2739,9 +2718,7 @@
     <w:p>
       <w:pPr>
         <w:pStyle w:val="a9"/>
-        <w:bidi/>
-        <w:spacing w:line="360" w:lineRule="auto"/>
-        <w:jc w:val="right"/>
+        <w:spacing w:line="360" w:lineRule="auto"/>
         <w:rPr>
           <w:rFonts w:ascii="David" w:hAnsi="David" w:cs="David"/>
           <w:sz w:val="24"/>
@@ -2762,9 +2739,7 @@
     <w:p>
       <w:pPr>
         <w:pStyle w:val="a9"/>
-        <w:bidi/>
-        <w:spacing w:line="360" w:lineRule="auto"/>
-        <w:jc w:val="right"/>
+        <w:spacing w:line="360" w:lineRule="auto"/>
         <w:rPr>
           <w:rFonts w:ascii="David" w:hAnsi="David" w:cs="David"/>
           <w:sz w:val="24"/>

</xml_diff>

<commit_message>
feat(reportes): actualizar plantilla a version 2025 y corregir mapeo de XML para docxtemplater
</commit_message>
<xml_diff>
--- a/template.docx
+++ b/template.docx
@@ -1,9 +1,10 @@
 
 <file path=word/document.xml><?xml version="1.0" encoding="utf-8"?>
-<w:document xmlns:wpc="http://schemas.microsoft.com/office/word/2010/wordprocessingCanvas" xmlns:mc="http://schemas.openxmlformats.org/markup-compatibility/2006" xmlns:o="urn:schemas-microsoft-com:office:office" xmlns:r="http://schemas.openxmlformats.org/officeDocument/2006/relationships" xmlns:m="http://schemas.openxmlformats.org/officeDocument/2006/math" xmlns:v="urn:schemas-microsoft-com:vml" xmlns:wp14="http://schemas.microsoft.com/office/word/2010/wordprocessingDrawing" xmlns:wp="http://schemas.openxmlformats.org/drawingml/2006/wordprocessingDrawing" xmlns:w10="urn:schemas-microsoft-com:office:word" xmlns:w="http://schemas.openxmlformats.org/wordprocessingml/2006/main" xmlns:w14="http://schemas.microsoft.com/office/word/2010/wordml" xmlns:w15="http://schemas.microsoft.com/office/word/2012/wordml" xmlns:wpg="http://schemas.microsoft.com/office/word/2010/wordprocessingGroup" xmlns:wpi="http://schemas.microsoft.com/office/word/2010/wordprocessingInk" xmlns:wne="http://schemas.microsoft.com/office/word/2006/wordml" xmlns:wps="http://schemas.microsoft.com/office/word/2010/wordprocessingShape" mc:Ignorable="w14 w15 wp14">
+<w:document xmlns:wpc="http://schemas.microsoft.com/office/word/2010/wordprocessingCanvas" xmlns:cx="http://schemas.microsoft.com/office/drawing/2014/chartex" xmlns:cx1="http://schemas.microsoft.com/office/drawing/2015/9/8/chartex" xmlns:cx2="http://schemas.microsoft.com/office/drawing/2015/10/21/chartex" xmlns:cx3="http://schemas.microsoft.com/office/drawing/2016/5/9/chartex" xmlns:cx4="http://schemas.microsoft.com/office/drawing/2016/5/10/chartex" xmlns:cx5="http://schemas.microsoft.com/office/drawing/2016/5/11/chartex" xmlns:cx6="http://schemas.microsoft.com/office/drawing/2016/5/12/chartex" xmlns:cx7="http://schemas.microsoft.com/office/drawing/2016/5/13/chartex" xmlns:cx8="http://schemas.microsoft.com/office/drawing/2016/5/14/chartex" xmlns:mc="http://schemas.openxmlformats.org/markup-compatibility/2006" xmlns:aink="http://schemas.microsoft.com/office/drawing/2016/ink" xmlns:am3d="http://schemas.microsoft.com/office/drawing/2017/model3d" xmlns:o="urn:schemas-microsoft-com:office:office" xmlns:oel="http://schemas.microsoft.com/office/2019/extlst" xmlns:r="http://schemas.openxmlformats.org/officeDocument/2006/relationships" xmlns:m="http://schemas.openxmlformats.org/officeDocument/2006/math" xmlns:v="urn:schemas-microsoft-com:vml" xmlns:wp14="http://schemas.microsoft.com/office/word/2010/wordprocessingDrawing" xmlns:wp="http://schemas.openxmlformats.org/drawingml/2006/wordprocessingDrawing" xmlns:w10="urn:schemas-microsoft-com:office:word" xmlns:w="http://schemas.openxmlformats.org/wordprocessingml/2006/main" xmlns:w14="http://schemas.microsoft.com/office/word/2010/wordml" xmlns:w15="http://schemas.microsoft.com/office/word/2012/wordml" xmlns:w16cex="http://schemas.microsoft.com/office/word/2018/wordml/cex" xmlns:w16cid="http://schemas.microsoft.com/office/word/2016/wordml/cid" xmlns:w16="http://schemas.microsoft.com/office/word/2018/wordml" xmlns:w16du="http://schemas.microsoft.com/office/word/2023/wordml/word16du" xmlns:w16sdtdh="http://schemas.microsoft.com/office/word/2020/wordml/sdtdatahash" xmlns:w16sdtfl="http://schemas.microsoft.com/office/word/2024/wordml/sdtformatlock" xmlns:w16se="http://schemas.microsoft.com/office/word/2015/wordml/symex" xmlns:wpg="http://schemas.microsoft.com/office/word/2010/wordprocessingGroup" xmlns:wpi="http://schemas.microsoft.com/office/word/2010/wordprocessingInk" xmlns:wne="http://schemas.microsoft.com/office/word/2006/wordml" xmlns:wps="http://schemas.microsoft.com/office/word/2010/wordprocessingShape" mc:Ignorable="w14 w15 w16se w16cid w16 w16cex w16sdtdh w16sdtfl w16du wp14">
   <w:body>
     <w:p>
       <w:pPr>
+        <w:bidi/>
         <w:spacing w:after="0" w:line="240" w:lineRule="auto"/>
         <w:rPr>
           <w:rFonts w:ascii="David" w:hAnsi="David" w:cs="David"/>
@@ -12,12 +13,10 @@
           <w:rtl/>
         </w:rPr>
       </w:pPr>
-      <w:bookmarkStart w:id="0" w:name="_GoBack"/>
-      <w:bookmarkEnd w:id="0"/>
-    </w:p>
-    <w:p>
-      <w:pPr>
-        <w:pStyle w:val="a9"/>
+    </w:p>
+    <w:p>
+      <w:pPr>
+        <w:bidi/>
         <w:spacing w:after="0" w:line="240" w:lineRule="auto"/>
         <w:rPr>
           <w:rFonts w:ascii="David" w:eastAsia="Arial Unicode MS" w:hAnsi="David" w:cs="David"/>
@@ -37,7 +36,6 @@
     </w:p>
     <w:p>
       <w:pPr>
-        <w:pStyle w:val="a9"/>
         <w:spacing w:after="0" w:line="240" w:lineRule="auto"/>
         <w:jc w:val="center"/>
         <w:rPr>
@@ -95,7 +93,6 @@
     </w:p>
     <w:p>
       <w:pPr>
-        <w:pStyle w:val="a9"/>
         <w:spacing w:after="0" w:line="240" w:lineRule="auto"/>
         <w:jc w:val="center"/>
         <w:rPr>
@@ -146,7 +143,6 @@
     </w:p>
     <w:p>
       <w:pPr>
-        <w:pStyle w:val="a9"/>
         <w:spacing w:line="360" w:lineRule="auto"/>
         <w:rPr>
           <w:rFonts w:ascii="David" w:eastAsia="Arial Unicode MS" w:hAnsi="David" w:cs="David"/>
@@ -169,6 +165,7 @@
           <w:rFonts w:ascii="David" w:eastAsia="Arial Unicode MS" w:hAnsi="David" w:cs="David" w:hint="cs"/>
           <w:sz w:val="24"/>
           <w:szCs w:val="24"/>
+          <w:u w:val="single"/>
           <w:rtl/>
         </w:rPr>
         <w:t>{fecha}</w:t>
@@ -278,6 +275,7 @@
           <w:rFonts w:ascii="David" w:eastAsia="Arial Unicode MS" w:hAnsi="David" w:cs="David" w:hint="cs"/>
           <w:sz w:val="24"/>
           <w:szCs w:val="24"/>
+          <w:u w:val="single"/>
           <w:rtl/>
         </w:rPr>
         <w:t>{importador}</w:t>
@@ -312,6 +310,7 @@
           <w:rFonts w:ascii="David" w:eastAsia="Arial Unicode MS" w:hAnsi="David" w:cs="David" w:hint="cs"/>
           <w:sz w:val="24"/>
           <w:szCs w:val="24"/>
+          <w:u w:val="single"/>
           <w:rtl/>
         </w:rPr>
         <w:t>{imp_telefono}</w:t>
@@ -346,6 +345,7 @@
           <w:rFonts w:ascii="David" w:eastAsia="Arial Unicode MS" w:hAnsi="David" w:cs="David" w:hint="cs"/>
           <w:sz w:val="24"/>
           <w:szCs w:val="24"/>
+          <w:u w:val="single"/>
           <w:rtl/>
         </w:rPr>
         <w:t>{imp_fax}</w:t>
@@ -379,6 +379,7 @@
           <w:rFonts w:ascii="David" w:eastAsia="Arial Unicode MS" w:hAnsi="David" w:cs="David" w:hint="cs"/>
           <w:sz w:val="24"/>
           <w:szCs w:val="24"/>
+          <w:u w:val="single"/>
           <w:rtl/>
         </w:rPr>
         <w:t>{imp_email}</w:t>
@@ -430,7 +431,7 @@
           <w:szCs w:val="24"/>
           <w:rtl/>
         </w:rPr>
-        <w:t>:{certificador_nombre}</w:t>
+        <w:t>:{certificador}</w:t>
       </w:r>
     </w:p>
     <w:p>
@@ -461,6 +462,7 @@
           <w:rFonts w:ascii="David" w:eastAsia="Arial Unicode MS" w:hAnsi="David" w:cs="David" w:hint="cs"/>
           <w:sz w:val="24"/>
           <w:szCs w:val="24"/>
+          <w:u w:val="single"/>
           <w:rtl/>
         </w:rPr>
         <w:t>{cert_telefono}</w:t>
@@ -494,6 +496,7 @@
           <w:rFonts w:ascii="David" w:eastAsia="Arial Unicode MS" w:hAnsi="David" w:cs="David" w:hint="cs"/>
           <w:sz w:val="24"/>
           <w:szCs w:val="24"/>
+          <w:u w:val="single"/>
           <w:rtl/>
         </w:rPr>
         <w:t>{cert_fax}</w:t>
@@ -527,6 +530,7 @@
           <w:rFonts w:ascii="David" w:eastAsia="Arial Unicode MS" w:hAnsi="David" w:cs="David" w:hint="cs"/>
           <w:sz w:val="24"/>
           <w:szCs w:val="24"/>
+          <w:u w:val="single"/>
           <w:rtl/>
         </w:rPr>
         <w:t>{cert_email}</w:t>
@@ -626,6 +630,7 @@
           <w:rFonts w:ascii="David" w:eastAsia="Arial Unicode MS" w:hAnsi="David" w:cs="David" w:hint="cs"/>
           <w:sz w:val="24"/>
           <w:szCs w:val="24"/>
+          <w:u w:val="single"/>
           <w:rtl/>
         </w:rPr>
         <w:t>{fab_contacto}</w:t>
@@ -667,6 +672,7 @@
           <w:rFonts w:ascii="David" w:eastAsia="Arial Unicode MS" w:hAnsi="David" w:cs="David" w:hint="cs"/>
           <w:sz w:val="24"/>
           <w:szCs w:val="24"/>
+          <w:u w:val="single"/>
           <w:rtl/>
         </w:rPr>
         <w:t>{fab_telefono}</w:t>
@@ -708,6 +714,7 @@
           <w:rFonts w:ascii="David" w:eastAsia="Arial Unicode MS" w:hAnsi="David" w:cs="David" w:hint="cs"/>
           <w:sz w:val="24"/>
           <w:szCs w:val="24"/>
+          <w:u w:val="single"/>
           <w:rtl/>
         </w:rPr>
         <w:t>{fab_web}</w:t>
@@ -749,6 +756,7 @@
           <w:rFonts w:ascii="David" w:eastAsia="Arial Unicode MS" w:hAnsi="David" w:cs="David" w:hint="cs"/>
           <w:sz w:val="24"/>
           <w:szCs w:val="24"/>
+          <w:u w:val="single"/>
           <w:rtl/>
         </w:rPr>
         <w:t>{fab_pais}</w:t>
@@ -760,13 +768,14 @@
           <w:szCs w:val="24"/>
           <w:rtl/>
         </w:rPr>
-        <w:t xml:space="preserve"> — עיר: </w:t>
-      </w:r>
-      <w:r>
-        <w:rPr>
-          <w:rFonts w:ascii="David" w:eastAsia="Arial Unicode MS" w:hAnsi="David" w:cs="David" w:hint="cs"/>
-          <w:sz w:val="24"/>
-          <w:szCs w:val="24"/>
+        <w:t xml:space="preserve">עיר: </w:t>
+      </w:r>
+      <w:r>
+        <w:rPr>
+          <w:rFonts w:ascii="David" w:eastAsia="Arial Unicode MS" w:hAnsi="David" w:cs="David" w:hint="cs"/>
+          <w:sz w:val="24"/>
+          <w:szCs w:val="24"/>
+          <w:u w:val="single"/>
           <w:rtl/>
         </w:rPr>
         <w:t>{fab_ciudad}</w:t>
@@ -835,6 +844,7 @@
           <w:rFonts w:ascii="David" w:eastAsia="Arial Unicode MS" w:hAnsi="David" w:cs="David" w:hint="cs"/>
           <w:sz w:val="24"/>
           <w:szCs w:val="24"/>
+          <w:u w:val="single"/>
           <w:rtl/>
         </w:rPr>
         <w:t>{productos}</w:t>
@@ -913,7 +923,7 @@
           <w:szCs w:val="24"/>
           <w:rtl/>
         </w:rPr>
-        <w:t>האם במפעל מיוצרים גם מוצרים לא כשרים: {non_kosher_answer}</w:t>
+        <w:t>האם במפעל מיוצרים גם מוצרים לא כשרים: כן/לא</w:t>
       </w:r>
     </w:p>
     <w:p>
@@ -952,6 +962,7 @@
           <w:rFonts w:ascii="David" w:eastAsia="Arial Unicode MS" w:hAnsi="David" w:cs="David" w:hint="cs"/>
           <w:sz w:val="24"/>
           <w:szCs w:val="24"/>
+          <w:u w:val="single"/>
           <w:rtl/>
         </w:rPr>
         <w:t>{limpieza}</w:t>
@@ -1003,6 +1014,7 @@
           <w:rFonts w:ascii="David" w:eastAsia="Arial Unicode MS" w:hAnsi="David" w:cs="David" w:hint="cs"/>
           <w:sz w:val="24"/>
           <w:szCs w:val="24"/>
+          <w:u w:val="single"/>
           <w:rtl/>
         </w:rPr>
         <w:t>{pesaj}</w:t>
@@ -1055,6 +1067,7 @@
           <w:rFonts w:ascii="David" w:eastAsia="Arial Unicode MS" w:hAnsi="David" w:cs="David" w:hint="cs"/>
           <w:sz w:val="24"/>
           <w:szCs w:val="24"/>
+          <w:u w:val="single"/>
           <w:rtl/>
         </w:rPr>
         <w:t>{productos_supervisados}</w:t>
@@ -1109,7 +1122,7 @@
           <w:szCs w:val="24"/>
           <w:rtl/>
         </w:rPr>
-        <w:t>בישול ישראל: {bishul_israel_answer}</w:t>
+        <w:t>בישול ישראל: כן/לא</w:t>
       </w:r>
     </w:p>
     <w:p>
@@ -1222,7 +1235,32 @@
     </w:p>
     <w:p>
       <w:pPr>
-        <w:pStyle w:val="a9"/>
+        <w:bidi/>
+        <w:spacing w:line="360" w:lineRule="auto"/>
+        <w:rPr>
+          <w:rFonts w:ascii="David" w:eastAsia="Arial Unicode MS" w:hAnsi="David" w:cs="David"/>
+          <w:b/>
+          <w:bCs/>
+          <w:sz w:val="24"/>
+          <w:szCs w:val="24"/>
+          <w:rtl/>
+        </w:rPr>
+      </w:pPr>
+      <w:r>
+        <w:rPr>
+          <w:rFonts w:ascii="David" w:eastAsia="Arial Unicode MS" w:hAnsi="David" w:cs="David"/>
+          <w:b/>
+          <w:bCs/>
+          <w:sz w:val="24"/>
+          <w:szCs w:val="24"/>
+          <w:rtl/>
+        </w:rPr>
+        <w:t xml:space="preserve">         </w:t>
+      </w:r>
+    </w:p>
+    <w:p>
+      <w:pPr>
+        <w:bidi/>
         <w:spacing w:line="360" w:lineRule="auto"/>
         <w:rPr>
           <w:rFonts w:ascii="David" w:eastAsia="Arial Unicode MS" w:hAnsi="David" w:cs="David"/>
@@ -1243,31 +1281,6 @@
           <w:rtl/>
         </w:rPr>
         <w:lastRenderedPageBreak/>
-        <w:t xml:space="preserve">         </w:t>
-      </w:r>
-    </w:p>
-    <w:p>
-      <w:pPr>
-        <w:pStyle w:val="a9"/>
-        <w:spacing w:line="360" w:lineRule="auto"/>
-        <w:rPr>
-          <w:rFonts w:ascii="David" w:eastAsia="Arial Unicode MS" w:hAnsi="David" w:cs="David"/>
-          <w:b/>
-          <w:bCs/>
-          <w:sz w:val="24"/>
-          <w:szCs w:val="24"/>
-          <w:rtl/>
-        </w:rPr>
-      </w:pPr>
-      <w:r>
-        <w:rPr>
-          <w:rFonts w:ascii="David" w:eastAsia="Arial Unicode MS" w:hAnsi="David" w:cs="David"/>
-          <w:b/>
-          <w:bCs/>
-          <w:sz w:val="24"/>
-          <w:szCs w:val="24"/>
-          <w:rtl/>
-        </w:rPr>
         <w:t xml:space="preserve"> 5. </w:t>
       </w:r>
       <w:r>
@@ -1297,7 +1310,7 @@
           <w:szCs w:val="24"/>
           <w:rtl/>
         </w:rPr>
-        <w:t>{afiyat_israel_answer}</w:t>
+        <w:t>כן/לא</w:t>
       </w:r>
     </w:p>
     <w:p>
@@ -1463,6 +1476,7 @@
           <w:rFonts w:ascii="David" w:eastAsia="Arial Unicode MS" w:hAnsi="David" w:cs="David" w:hint="cs"/>
           <w:sz w:val="24"/>
           <w:szCs w:val="24"/>
+          <w:u w:val="single"/>
           <w:rtl/>
         </w:rPr>
         <w:t>{mashgiaj_nombre}</w:t>
@@ -1572,6 +1586,7 @@
           <w:rFonts w:ascii="David" w:eastAsia="Arial Unicode MS" w:hAnsi="David" w:cs="David" w:hint="cs"/>
           <w:sz w:val="24"/>
           <w:szCs w:val="24"/>
+          <w:u w:val="single"/>
           <w:rtl/>
         </w:rPr>
         <w:t>{mashgiaj_tel}</w:t>
@@ -1633,6 +1648,7 @@
           <w:rFonts w:ascii="David" w:eastAsia="Arial Unicode MS" w:hAnsi="David" w:cs="David" w:hint="cs"/>
           <w:sz w:val="24"/>
           <w:szCs w:val="24"/>
+          <w:u w:val="single"/>
           <w:rtl/>
         </w:rPr>
         <w:t>{mashgiaj_email}</w:t>
@@ -1685,6 +1701,7 @@
           <w:rFonts w:ascii="David" w:eastAsia="Arial Unicode MS" w:hAnsi="David" w:cs="David" w:hint="cs"/>
           <w:sz w:val="24"/>
           <w:szCs w:val="24"/>
+          <w:u w:val="single"/>
           <w:rtl/>
         </w:rPr>
         <w:t>{fechas_supervision}</w:t>
@@ -1737,6 +1754,7 @@
           <w:rFonts w:ascii="David" w:eastAsia="Arial Unicode MS" w:hAnsi="David" w:cs="David" w:hint="cs"/>
           <w:sz w:val="24"/>
           <w:szCs w:val="24"/>
+          <w:u w:val="single"/>
           <w:rtl/>
         </w:rPr>
         <w:t>{hora_inicio}</w:t>
@@ -1771,13 +1789,34 @@
           <w:szCs w:val="24"/>
           <w:rtl/>
         </w:rPr>
-        <w:t xml:space="preserve"> שעת הסייום ייצור : </w:t>
-      </w:r>
-      <w:r>
-        <w:rPr>
-          <w:rFonts w:ascii="David" w:eastAsia="Arial Unicode MS" w:hAnsi="David" w:cs="David" w:hint="cs"/>
-          <w:sz w:val="24"/>
-          <w:szCs w:val="24"/>
+        <w:t xml:space="preserve"> שעת </w:t>
+      </w:r>
+      <w:proofErr w:type="spellStart"/>
+      <w:r>
+        <w:rPr>
+          <w:rFonts w:ascii="David" w:eastAsia="Arial Unicode MS" w:hAnsi="David" w:cs="David" w:hint="cs"/>
+          <w:sz w:val="24"/>
+          <w:szCs w:val="24"/>
+          <w:rtl/>
+        </w:rPr>
+        <w:t>הסייום</w:t>
+      </w:r>
+      <w:proofErr w:type="spellEnd"/>
+      <w:r>
+        <w:rPr>
+          <w:rFonts w:ascii="David" w:eastAsia="Arial Unicode MS" w:hAnsi="David" w:cs="David" w:hint="cs"/>
+          <w:sz w:val="24"/>
+          <w:szCs w:val="24"/>
+          <w:rtl/>
+        </w:rPr>
+        <w:t xml:space="preserve"> ייצור : </w:t>
+      </w:r>
+      <w:r>
+        <w:rPr>
+          <w:rFonts w:ascii="David" w:eastAsia="Arial Unicode MS" w:hAnsi="David" w:cs="David" w:hint="cs"/>
+          <w:sz w:val="24"/>
+          <w:szCs w:val="24"/>
+          <w:u w:val="single"/>
           <w:rtl/>
         </w:rPr>
         <w:t>{hora_fin}</w:t>
@@ -1845,13 +1884,34 @@
           <w:szCs w:val="24"/>
           <w:rtl/>
         </w:rPr>
-        <w:t xml:space="preserve">ציין את נוסח הכשרות המלא המצויין ע"ג האריזה: </w:t>
-      </w:r>
-      <w:r>
-        <w:rPr>
-          <w:rFonts w:ascii="David" w:eastAsia="Arial Unicode MS" w:hAnsi="David" w:cs="David" w:hint="cs"/>
-          <w:sz w:val="24"/>
-          <w:szCs w:val="24"/>
+        <w:t xml:space="preserve">ציין את נוסח הכשרות המלא </w:t>
+      </w:r>
+      <w:proofErr w:type="spellStart"/>
+      <w:r>
+        <w:rPr>
+          <w:rFonts w:ascii="David" w:eastAsia="Arial Unicode MS" w:hAnsi="David" w:cs="David"/>
+          <w:sz w:val="24"/>
+          <w:szCs w:val="24"/>
+          <w:rtl/>
+        </w:rPr>
+        <w:t>המצויין</w:t>
+      </w:r>
+      <w:proofErr w:type="spellEnd"/>
+      <w:r>
+        <w:rPr>
+          <w:rFonts w:ascii="David" w:eastAsia="Arial Unicode MS" w:hAnsi="David" w:cs="David"/>
+          <w:sz w:val="24"/>
+          <w:szCs w:val="24"/>
+          <w:rtl/>
+        </w:rPr>
+        <w:t xml:space="preserve"> ע"ג האריזה: </w:t>
+      </w:r>
+      <w:r>
+        <w:rPr>
+          <w:rFonts w:ascii="David" w:eastAsia="Arial Unicode MS" w:hAnsi="David" w:cs="David" w:hint="cs"/>
+          <w:sz w:val="24"/>
+          <w:szCs w:val="24"/>
+          <w:u w:val="single"/>
           <w:rtl/>
         </w:rPr>
         <w:t>{texto_kashrut}</w:t>
@@ -1885,6 +1945,7 @@
           <w:rFonts w:ascii="David" w:eastAsia="Arial Unicode MS" w:hAnsi="David" w:cs="David" w:hint="cs"/>
           <w:sz w:val="24"/>
           <w:szCs w:val="24"/>
+          <w:u w:val="single"/>
           <w:rtl/>
         </w:rPr>
         <w:t>{codigo_produccion}</w:t>
@@ -1918,6 +1979,7 @@
           <w:rFonts w:ascii="David" w:eastAsia="Arial Unicode MS" w:hAnsi="David" w:cs="David" w:hint="cs"/>
           <w:sz w:val="24"/>
           <w:szCs w:val="24"/>
+          <w:u w:val="single"/>
           <w:rtl/>
         </w:rPr>
         <w:t>{fecha_vencimiento}</w:t>
@@ -1951,6 +2013,7 @@
           <w:rFonts w:ascii="David" w:eastAsia="Arial Unicode MS" w:hAnsi="David" w:cs="David" w:hint="cs"/>
           <w:sz w:val="24"/>
           <w:szCs w:val="24"/>
+          <w:u w:val="single"/>
           <w:rtl/>
         </w:rPr>
         <w:t>{hologramas}</w:t>
@@ -1984,6 +2047,7 @@
           <w:rFonts w:ascii="David" w:eastAsia="Arial Unicode MS" w:hAnsi="David" w:cs="David" w:hint="cs"/>
           <w:sz w:val="24"/>
           <w:szCs w:val="24"/>
+          <w:u w:val="single"/>
           <w:rtl/>
         </w:rPr>
         <w:t>{sellos}</w:t>
@@ -2093,6 +2157,7 @@
           <w:rFonts w:ascii="David" w:eastAsia="Arial Unicode MS" w:hAnsi="David" w:cs="David" w:hint="cs"/>
           <w:sz w:val="24"/>
           <w:szCs w:val="24"/>
+          <w:u w:val="single"/>
           <w:rtl/>
         </w:rPr>
         <w:t>{fecha_visita}</w:t>
@@ -2111,6 +2176,7 @@
           <w:rFonts w:ascii="David" w:eastAsia="Arial Unicode MS" w:hAnsi="David" w:cs="David" w:hint="cs"/>
           <w:sz w:val="24"/>
           <w:szCs w:val="24"/>
+          <w:u w:val="single"/>
           <w:rtl/>
         </w:rPr>
         <w:t>{frecuencia_visitas}</w:t>
@@ -2145,6 +2211,7 @@
           <w:rFonts w:ascii="David" w:eastAsia="Arial Unicode MS" w:hAnsi="David" w:cs="David" w:hint="cs"/>
           <w:sz w:val="24"/>
           <w:szCs w:val="24"/>
+          <w:u w:val="single"/>
           <w:rtl/>
         </w:rPr>
         <w:t>{mashgiaj_reg_tel}</w:t>
@@ -2178,6 +2245,7 @@
           <w:rFonts w:ascii="David" w:eastAsia="Arial Unicode MS" w:hAnsi="David" w:cs="David" w:hint="cs"/>
           <w:sz w:val="24"/>
           <w:szCs w:val="24"/>
+          <w:u w:val="single"/>
           <w:rtl/>
         </w:rPr>
         <w:t>{mashgiaj_reg_email}</w:t>
@@ -2231,23 +2299,45 @@
           <w:rFonts w:ascii="David" w:eastAsia="Arial Unicode MS" w:hAnsi="David" w:cs="David"/>
           <w:sz w:val="24"/>
           <w:szCs w:val="24"/>
-          <w:rtl/>
-        </w:rPr>
-      </w:pPr>
-      <w:r>
-        <w:rPr>
-          <w:rFonts w:ascii="David" w:eastAsia="Arial Unicode MS" w:hAnsi="David" w:cs="David"/>
-          <w:sz w:val="24"/>
-          <w:szCs w:val="24"/>
-          <w:rtl/>
-        </w:rPr>
-        <w:t xml:space="preserve">חומרי הגלם הינם בכשרות של רבנות מוכרת ומוסמכת ע"י הרה"ר בהם השתמשו לצורך ייצור המוגמר: </w:t>
-      </w:r>
-      <w:r>
-        <w:rPr>
-          <w:rFonts w:ascii="David" w:eastAsia="Arial Unicode MS" w:hAnsi="David" w:cs="David" w:hint="cs"/>
-          <w:sz w:val="24"/>
-          <w:szCs w:val="24"/>
+          <w:u w:val="single"/>
+          <w:rtl/>
+        </w:rPr>
+      </w:pPr>
+      <w:r>
+        <w:rPr>
+          <w:rFonts w:ascii="David" w:eastAsia="Arial Unicode MS" w:hAnsi="David" w:cs="David"/>
+          <w:sz w:val="24"/>
+          <w:szCs w:val="24"/>
+          <w:rtl/>
+        </w:rPr>
+        <w:t xml:space="preserve">חומרי הגלם הינם בכשרות של רבנות מוכרת ומוסמכת ע"י </w:t>
+      </w:r>
+      <w:proofErr w:type="spellStart"/>
+      <w:r>
+        <w:rPr>
+          <w:rFonts w:ascii="David" w:eastAsia="Arial Unicode MS" w:hAnsi="David" w:cs="David"/>
+          <w:sz w:val="24"/>
+          <w:szCs w:val="24"/>
+          <w:rtl/>
+        </w:rPr>
+        <w:t>הרה"ר</w:t>
+      </w:r>
+      <w:proofErr w:type="spellEnd"/>
+      <w:r>
+        <w:rPr>
+          <w:rFonts w:ascii="David" w:eastAsia="Arial Unicode MS" w:hAnsi="David" w:cs="David"/>
+          <w:sz w:val="24"/>
+          <w:szCs w:val="24"/>
+          <w:rtl/>
+        </w:rPr>
+        <w:t xml:space="preserve"> בהם השתמשו לצורך ייצור המוגמר: </w:t>
+      </w:r>
+      <w:r>
+        <w:rPr>
+          <w:rFonts w:ascii="David" w:eastAsia="Arial Unicode MS" w:hAnsi="David" w:cs="David" w:hint="cs"/>
+          <w:sz w:val="24"/>
+          <w:szCs w:val="24"/>
+          <w:u w:val="single"/>
           <w:rtl/>
         </w:rPr>
         <w:t>{materias_primas}</w:t>
@@ -2261,6 +2351,7 @@
           <w:rFonts w:ascii="David" w:eastAsia="Arial Unicode MS" w:hAnsi="David" w:cs="David"/>
           <w:sz w:val="24"/>
           <w:szCs w:val="24"/>
+          <w:u w:val="single"/>
           <w:rtl/>
         </w:rPr>
       </w:pPr>
@@ -2356,23 +2447,23 @@
     </w:p>
     <w:p>
       <w:pPr>
-        <w:pStyle w:val="a9"/>
-        <w:spacing w:line="360" w:lineRule="auto"/>
-        <w:rPr>
-          <w:rFonts w:ascii="David" w:eastAsia="Arial Unicode MS" w:hAnsi="David" w:cs="David"/>
-          <w:sz w:val="24"/>
-          <w:szCs w:val="24"/>
-          <w:rtl/>
-        </w:rPr>
-      </w:pPr>
-      <w:r>
-        <w:rPr>
-          <w:rFonts w:ascii="David" w:eastAsia="Arial Unicode MS" w:hAnsi="David" w:cs="David" w:hint="cs"/>
-          <w:sz w:val="24"/>
-          <w:szCs w:val="24"/>
-          <w:rtl/>
-        </w:rPr>
-        <w:lastRenderedPageBreak/>
+        <w:bidi/>
+        <w:spacing w:line="360" w:lineRule="auto"/>
+        <w:rPr>
+          <w:rFonts w:ascii="David" w:eastAsia="Arial Unicode MS" w:hAnsi="David" w:cs="David"/>
+          <w:sz w:val="24"/>
+          <w:szCs w:val="24"/>
+          <w:rtl/>
+        </w:rPr>
+      </w:pPr>
+      <w:r>
+        <w:rPr>
+          <w:rFonts w:ascii="David" w:eastAsia="Arial Unicode MS" w:hAnsi="David" w:cs="David" w:hint="cs"/>
+          <w:sz w:val="24"/>
+          <w:szCs w:val="24"/>
+          <w:u w:val="single"/>
+          <w:rtl/>
+        </w:rPr>
         <w:t xml:space="preserve">               </w:t>
       </w:r>
       <w:r>
@@ -2380,24 +2471,84 @@
           <w:rFonts w:ascii="David" w:eastAsia="Arial Unicode MS" w:hAnsi="David" w:cs="David" w:hint="cs"/>
           <w:sz w:val="24"/>
           <w:szCs w:val="24"/>
-          <w:rtl/>
-        </w:rPr>
-        <w:t/>
-      </w:r>
-      <w:r>
-        <w:rPr>
-          <w:rFonts w:ascii="David" w:eastAsia="Arial Unicode MS" w:hAnsi="David" w:cs="David" w:hint="cs"/>
-          <w:sz w:val="24"/>
-          <w:szCs w:val="24"/>
-          <w:rtl/>
-        </w:rPr>
-        <w:t/>
-      </w:r>
-      <w:r>
-        <w:rPr>
-          <w:rFonts w:ascii="David" w:eastAsia="Arial Unicode MS" w:hAnsi="David" w:cs="David" w:hint="cs"/>
-          <w:sz w:val="24"/>
-          <w:szCs w:val="24"/>
+          <w:u w:val="single"/>
+          <w:rtl/>
+        </w:rPr>
+        <w:t>__</w:t>
+      </w:r>
+      <w:r>
+        <w:rPr>
+          <w:rFonts w:ascii="David" w:eastAsia="Arial Unicode MS" w:hAnsi="David" w:cs="David" w:hint="cs"/>
+          <w:sz w:val="24"/>
+          <w:szCs w:val="24"/>
+          <w:u w:val="single"/>
+          <w:rtl/>
+        </w:rPr>
+        <w:t>{%firma_certificador}</w:t>
+      </w:r>
+      <w:r>
+        <w:rPr>
+          <w:rFonts w:ascii="David" w:eastAsia="Arial Unicode MS" w:hAnsi="David" w:cs="David" w:hint="cs"/>
+          <w:sz w:val="24"/>
+          <w:szCs w:val="24"/>
+          <w:u w:val="single"/>
+          <w:rtl/>
+        </w:rPr>
+        <w:t>{firma_certificador_2}</w:t>
+      </w:r>
+      <w:r>
+        <w:rPr>
+          <w:rFonts w:ascii="David" w:eastAsia="Arial Unicode MS" w:hAnsi="David" w:cs="David" w:hint="cs"/>
+          <w:sz w:val="24"/>
+          <w:szCs w:val="24"/>
+          <w:u w:val="single"/>
+          <w:rtl/>
+        </w:rPr>
+        <w:t>{firma_certificador_3}</w:t>
+      </w:r>
+      <w:r>
+        <w:rPr>
+          <w:rFonts w:ascii="David" w:eastAsia="Arial Unicode MS" w:hAnsi="David" w:cs="David"/>
+          <w:sz w:val="24"/>
+          <w:szCs w:val="24"/>
+          <w:rtl/>
+        </w:rPr>
+        <w:t xml:space="preserve">       </w:t>
+      </w:r>
+      <w:r>
+        <w:rPr>
+          <w:rFonts w:ascii="David" w:eastAsia="Arial Unicode MS" w:hAnsi="David" w:cs="David" w:hint="cs"/>
+          <w:sz w:val="24"/>
+          <w:szCs w:val="24"/>
+          <w:rtl/>
+        </w:rPr>
+        <w:t xml:space="preserve">       </w:t>
+      </w:r>
+      <w:r>
+        <w:rPr>
+          <w:rFonts w:ascii="David" w:eastAsia="Arial Unicode MS" w:hAnsi="David" w:cs="David"/>
+          <w:sz w:val="24"/>
+          <w:szCs w:val="24"/>
+          <w:rtl/>
+        </w:rPr>
+        <w:t xml:space="preserve">      </w:t>
+      </w:r>
+      <w:r>
+        <w:rPr>
+          <w:rFonts w:ascii="David" w:eastAsia="Arial Unicode MS" w:hAnsi="David" w:cs="David"/>
+          <w:sz w:val="24"/>
+          <w:szCs w:val="24"/>
+          <w:u w:val="single"/>
+          <w:rtl/>
+        </w:rPr>
+        <w:tab/>
+      </w:r>
+      <w:r>
+        <w:rPr>
+          <w:rFonts w:ascii="David" w:eastAsia="Arial Unicode MS" w:hAnsi="David" w:cs="David" w:hint="cs"/>
+          <w:sz w:val="24"/>
+          <w:szCs w:val="24"/>
+          <w:u w:val="single"/>
           <w:rtl/>
         </w:rPr>
         <w:t>{%firma_mashgiaj}</w:t>
@@ -2407,68 +2558,15 @@
           <w:rFonts w:ascii="David" w:eastAsia="Arial Unicode MS" w:hAnsi="David" w:cs="David" w:hint="cs"/>
           <w:sz w:val="24"/>
           <w:szCs w:val="24"/>
-          <w:rtl/>
-        </w:rPr>
-        <w:t/>
-      </w:r>
-      <w:r>
-        <w:rPr>
-          <w:rFonts w:ascii="David" w:eastAsia="Arial Unicode MS" w:hAnsi="David" w:cs="David"/>
-          <w:sz w:val="24"/>
-          <w:szCs w:val="24"/>
-          <w:rtl/>
-        </w:rPr>
-        <w:t xml:space="preserve">       </w:t>
-      </w:r>
-      <w:r>
-        <w:rPr>
-          <w:rFonts w:ascii="David" w:eastAsia="Arial Unicode MS" w:hAnsi="David" w:cs="David" w:hint="cs"/>
-          <w:sz w:val="24"/>
-          <w:szCs w:val="24"/>
-          <w:rtl/>
-        </w:rPr>
-        <w:t xml:space="preserve">       </w:t>
-      </w:r>
-      <w:r>
-        <w:rPr>
-          <w:rFonts w:ascii="David" w:eastAsia="Arial Unicode MS" w:hAnsi="David" w:cs="David"/>
-          <w:sz w:val="24"/>
-          <w:szCs w:val="24"/>
-          <w:rtl/>
-        </w:rPr>
-        <w:t xml:space="preserve">      </w:t>
-      </w:r>
-      <w:r>
-        <w:rPr>
-          <w:rFonts w:ascii="David" w:eastAsia="Arial Unicode MS" w:hAnsi="David" w:cs="David"/>
-          <w:sz w:val="24"/>
-          <w:szCs w:val="24"/>
-          <w:rtl/>
-        </w:rPr>
-        <w:tab/>
-      </w:r>
-      <w:r>
-        <w:rPr>
-          <w:rFonts w:ascii="David" w:eastAsia="Arial Unicode MS" w:hAnsi="David" w:cs="David" w:hint="cs"/>
-          <w:sz w:val="24"/>
-          <w:szCs w:val="24"/>
-          <w:rtl/>
-        </w:rPr>
-        <w:t/>
-      </w:r>
-      <w:r>
-        <w:rPr>
-          <w:rFonts w:ascii="David" w:eastAsia="Arial Unicode MS" w:hAnsi="David" w:cs="David" w:hint="cs"/>
-          <w:sz w:val="24"/>
-          <w:szCs w:val="24"/>
-          <w:rtl/>
-        </w:rPr>
-        <w:t/>
-      </w:r>
-    </w:p>
-    <w:p>
-      <w:pPr>
-        <w:pStyle w:val="a9"/>
+          <w:u w:val="single"/>
+          <w:rtl/>
+        </w:rPr>
+        <w:t>{firma_mashgiaj_2}</w:t>
+      </w:r>
+    </w:p>
+    <w:p>
+      <w:pPr>
+        <w:bidi/>
         <w:spacing w:line="360" w:lineRule="auto"/>
         <w:rPr>
           <w:rFonts w:ascii="David" w:eastAsia="Arial Unicode MS" w:hAnsi="David" w:cs="David"/>
@@ -2508,6 +2606,7 @@
     <w:p>
       <w:pPr>
         <w:spacing w:line="360" w:lineRule="auto"/>
+        <w:jc w:val="right"/>
         <w:rPr>
           <w:rFonts w:ascii="David" w:hAnsi="David" w:cs="David"/>
           <w:sz w:val="24"/>
@@ -2528,6 +2627,7 @@
     <w:p>
       <w:pPr>
         <w:spacing w:line="360" w:lineRule="auto"/>
+        <w:jc w:val="right"/>
         <w:rPr>
           <w:rFonts w:ascii="David" w:hAnsi="David" w:cs="David"/>
           <w:sz w:val="24"/>
@@ -2537,8 +2637,8 @@
     </w:p>
     <w:p>
       <w:pPr>
-        <w:pStyle w:val="a9"/>
-        <w:spacing w:line="360" w:lineRule="auto"/>
+        <w:spacing w:line="360" w:lineRule="auto"/>
+        <w:jc w:val="right"/>
         <w:rPr>
           <w:rFonts w:ascii="David" w:eastAsia="Arial Unicode MS" w:hAnsi="David" w:cs="David"/>
           <w:sz w:val="24"/>
@@ -2559,62 +2659,97 @@
           <w:rFonts w:ascii="David" w:eastAsia="Arial Unicode MS" w:hAnsi="David" w:cs="David" w:hint="cs"/>
           <w:sz w:val="24"/>
           <w:szCs w:val="24"/>
-          <w:rtl/>
-        </w:rPr>
-        <w:t>{%firma_certificador}</w:t>
-      </w:r>
-      <w:r>
-        <w:rPr>
-          <w:rFonts w:ascii="David" w:eastAsia="Arial Unicode MS" w:hAnsi="David" w:cs="David" w:hint="cs"/>
-          <w:sz w:val="24"/>
-          <w:szCs w:val="24"/>
-          <w:rtl/>
-        </w:rPr>
-        <w:t/>
-      </w:r>
-    </w:p>
-    <w:p>
-      <w:pPr>
-        <w:spacing w:line="360" w:lineRule="auto"/>
-        <w:rPr>
-          <w:rFonts w:ascii="David" w:eastAsia="Arial Unicode MS" w:hAnsi="David" w:cs="David"/>
-          <w:sz w:val="24"/>
-          <w:szCs w:val="24"/>
-        </w:rPr>
-      </w:pPr>
-    </w:p>
-    <w:p>
-      <w:pPr>
-        <w:spacing w:line="360" w:lineRule="auto"/>
-        <w:rPr>
-          <w:rFonts w:ascii="David" w:eastAsia="Arial Unicode MS" w:hAnsi="David" w:cs="David"/>
-          <w:sz w:val="24"/>
-          <w:szCs w:val="24"/>
-        </w:rPr>
-      </w:pPr>
-    </w:p>
-    <w:p>
-      <w:pPr>
-        <w:spacing w:line="360" w:lineRule="auto"/>
-        <w:rPr>
-          <w:rFonts w:ascii="David" w:eastAsia="Arial Unicode MS" w:hAnsi="David" w:cs="David"/>
-          <w:sz w:val="24"/>
-          <w:szCs w:val="24"/>
-          <w:rtl/>
-        </w:rPr>
-      </w:pPr>
-    </w:p>
-    <w:p>
-      <w:pPr>
-        <w:pStyle w:val="a9"/>
+          <w:u w:val="single"/>
+          <w:rtl/>
+        </w:rPr>
+        <w:t>{proceso_produccion}</w:t>
+      </w:r>
+      <w:r>
+        <w:rPr>
+          <w:rFonts w:ascii="David" w:eastAsia="Arial Unicode MS" w:hAnsi="David" w:cs="David" w:hint="cs"/>
+          <w:sz w:val="24"/>
+          <w:szCs w:val="24"/>
+          <w:u w:val="single"/>
+          <w:rtl/>
+        </w:rPr>
+        <w:t>{proceso_produccion_2}</w:t>
+      </w:r>
+    </w:p>
+    <w:p>
+      <w:pPr>
+        <w:spacing w:line="360" w:lineRule="auto"/>
+        <w:jc w:val="right"/>
+        <w:rPr>
+          <w:rFonts w:ascii="David" w:eastAsia="Arial Unicode MS" w:hAnsi="David" w:cs="David"/>
+          <w:sz w:val="24"/>
+          <w:szCs w:val="24"/>
+        </w:rPr>
+      </w:pPr>
+    </w:p>
+    <w:p>
+      <w:pPr>
+        <w:spacing w:line="360" w:lineRule="auto"/>
+        <w:jc w:val="right"/>
+        <w:rPr>
+          <w:rFonts w:ascii="David" w:eastAsia="Arial Unicode MS" w:hAnsi="David" w:cs="David"/>
+          <w:sz w:val="24"/>
+          <w:szCs w:val="24"/>
+        </w:rPr>
+      </w:pPr>
+    </w:p>
+    <w:p>
+      <w:pPr>
+        <w:spacing w:line="360" w:lineRule="auto"/>
+        <w:jc w:val="right"/>
+        <w:rPr>
+          <w:rFonts w:ascii="David" w:eastAsia="Arial Unicode MS" w:hAnsi="David" w:cs="David"/>
+          <w:sz w:val="24"/>
+          <w:szCs w:val="24"/>
+          <w:rtl/>
+        </w:rPr>
+      </w:pPr>
+    </w:p>
+    <w:p>
+      <w:pPr>
+        <w:bidi/>
         <w:spacing w:line="360" w:lineRule="auto"/>
         <w:rPr>
           <w:rFonts w:ascii="David" w:hAnsi="David" w:cs="David"/>
-          <w:sz w:val="24"/>
-          <w:szCs w:val="24"/>
-          <w:rtl/>
-        </w:rPr>
-      </w:pPr>
+          <w:b/>
+          <w:bCs/>
+          <w:sz w:val="24"/>
+          <w:szCs w:val="24"/>
+          <w:rtl/>
+        </w:rPr>
+      </w:pPr>
+      <w:r>
+        <w:rPr>
+          <w:rFonts w:ascii="David" w:eastAsia="Arial Unicode MS" w:hAnsi="David" w:cs="David"/>
+          <w:sz w:val="24"/>
+          <w:szCs w:val="24"/>
+          <w:rtl/>
+        </w:rPr>
+        <w:t xml:space="preserve">חתימת המשגיח: </w:t>
+      </w:r>
+      <w:r>
+        <w:rPr>
+          <w:rFonts w:ascii="David" w:eastAsia="Arial Unicode MS" w:hAnsi="David" w:cs="David" w:hint="cs"/>
+          <w:sz w:val="24"/>
+          <w:szCs w:val="24"/>
+          <w:u w:val="single"/>
+          <w:rtl/>
+        </w:rPr>
+        <w:t>{%firma_final}</w:t>
+      </w:r>
+      <w:r>
+        <w:rPr>
+          <w:rFonts w:ascii="David" w:hAnsi="David" w:cs="David"/>
+          <w:sz w:val="24"/>
+          <w:szCs w:val="24"/>
+          <w:rtl/>
+        </w:rPr>
+        <w:br/>
+      </w:r>
       <w:r>
         <w:rPr>
           <w:rFonts w:ascii="David" w:hAnsi="David" w:cs="David" w:hint="cs"/>
@@ -2622,24 +2757,30 @@
           <w:szCs w:val="24"/>
           <w:rtl/>
         </w:rPr>
-        <w:t>{proceso_produccion}</w:t>
-      </w:r>
-    </w:p>
-    <w:p>
-      <w:pPr>
-        <w:spacing w:line="360" w:lineRule="auto"/>
+        <w:t xml:space="preserve">תאריך : </w:t>
+      </w:r>
+      <w:r>
+        <w:rPr>
+          <w:rFonts w:ascii="David" w:eastAsia="Arial Unicode MS" w:hAnsi="David" w:cs="David" w:hint="cs"/>
+          <w:sz w:val="24"/>
+          <w:szCs w:val="24"/>
+          <w:u w:val="single"/>
+          <w:rtl/>
+        </w:rPr>
+        <w:t>{fecha_final}</w:t>
+      </w:r>
+      <w:r>
         <w:rPr>
           <w:rFonts w:ascii="David" w:hAnsi="David" w:cs="David"/>
-          <w:sz w:val="24"/>
-          <w:szCs w:val="24"/>
-          <w:rtl/>
-        </w:rPr>
-      </w:pPr>
-    </w:p>
-    <w:p>
-      <w:pPr>
-        <w:pStyle w:val="a9"/>
-        <w:spacing w:line="360" w:lineRule="auto"/>
+          <w:b/>
+          <w:bCs/>
+          <w:sz w:val="24"/>
+          <w:szCs w:val="24"/>
+          <w:rtl/>
+        </w:rPr>
+        <w:softHyphen/>
+      </w:r>
+      <w:r>
         <w:rPr>
           <w:rFonts w:ascii="David" w:hAnsi="David" w:cs="David"/>
           <w:b/>
@@ -2648,121 +2789,37 @@
           <w:szCs w:val="24"/>
           <w:rtl/>
         </w:rPr>
-      </w:pPr>
-      <w:r>
-        <w:rPr>
-          <w:rFonts w:ascii="David" w:hAnsi="David" w:cs="David" w:hint="cs"/>
-          <w:b/>
-          <w:bCs/>
-          <w:sz w:val="24"/>
-          <w:szCs w:val="24"/>
-          <w:rtl/>
-        </w:rPr>
-        <w:t xml:space="preserve">חתימה סופית</w:t>
-      </w:r>
-    </w:p>
-    <w:p>
-      <w:pPr>
-        <w:pStyle w:val="a9"/>
+        <w:softHyphen/>
+      </w:r>
+    </w:p>
+    <w:p>
+      <w:pPr>
+        <w:bidi/>
         <w:spacing w:line="360" w:lineRule="auto"/>
         <w:rPr>
           <w:rFonts w:ascii="David" w:hAnsi="David" w:cs="David"/>
-          <w:sz w:val="24"/>
-          <w:szCs w:val="24"/>
-          <w:rtl/>
-        </w:rPr>
-      </w:pPr>
-      <w:r>
-        <w:rPr>
-          <w:rFonts w:ascii="David" w:hAnsi="David" w:cs="David" w:hint="cs"/>
-          <w:sz w:val="24"/>
-          <w:szCs w:val="24"/>
-          <w:rtl/>
-        </w:rPr>
-        <w:t xml:space="preserve">חתימת המשגיח:</w:t>
-      </w:r>
-    </w:p>
-    <w:p>
-      <w:pPr>
-        <w:pStyle w:val="a9"/>
-        <w:spacing w:line="360" w:lineRule="auto"/>
-        <w:rPr>
-          <w:rFonts w:ascii="David" w:hAnsi="David" w:cs="David"/>
-          <w:sz w:val="24"/>
-          <w:szCs w:val="24"/>
-          <w:rtl/>
-        </w:rPr>
-      </w:pPr>
-      <w:r>
-        <w:rPr>
-          <w:rFonts w:ascii="David" w:hAnsi="David" w:cs="David" w:hint="cs"/>
-          <w:sz w:val="24"/>
-          <w:szCs w:val="24"/>
-          <w:rtl/>
-        </w:rPr>
-        <w:t>{%firma_final}</w:t>
-      </w:r>
-    </w:p>
-    <w:p>
-      <w:pPr>
-        <w:pStyle w:val="a9"/>
-        <w:spacing w:line="360" w:lineRule="auto"/>
-        <w:rPr>
-          <w:rFonts w:ascii="David" w:hAnsi="David" w:cs="David"/>
-          <w:sz w:val="24"/>
-          <w:szCs w:val="24"/>
-          <w:rtl/>
-        </w:rPr>
-      </w:pPr>
-    </w:p>
-    <w:p>
-      <w:pPr>
-        <w:pStyle w:val="a9"/>
-        <w:spacing w:line="360" w:lineRule="auto"/>
-        <w:rPr>
-          <w:rFonts w:ascii="David" w:hAnsi="David" w:cs="David"/>
-          <w:sz w:val="24"/>
-          <w:szCs w:val="24"/>
-          <w:rtl/>
-        </w:rPr>
-      </w:pPr>
-      <w:r>
-        <w:rPr>
-          <w:rFonts w:ascii="David" w:hAnsi="David" w:cs="David" w:hint="cs"/>
-          <w:sz w:val="24"/>
-          <w:szCs w:val="24"/>
-          <w:rtl/>
-        </w:rPr>
-        <w:t xml:space="preserve">תאריך: {fecha_final}</w:t>
-      </w:r>
-    </w:p>
-    <w:p>
-      <w:pPr>
-        <w:pStyle w:val="a9"/>
-        <w:spacing w:line="360" w:lineRule="auto"/>
-        <w:rPr>
-          <w:rFonts w:ascii="David" w:hAnsi="David" w:cs="David"/>
-          <w:sz w:val="24"/>
-          <w:szCs w:val="24"/>
-          <w:rtl/>
-        </w:rPr>
-      </w:pPr>
-      <w:r>
-        <w:rPr>
-          <w:rFonts w:ascii="David" w:hAnsi="David" w:cs="David" w:hint="cs"/>
-          <w:sz w:val="24"/>
-          <w:szCs w:val="24"/>
-          <w:rtl/>
-        </w:rPr>
-        <w:t xml:space="preserve">(זו חתימתי והנתונים שמסרתי הינם נכונים ומדויקים.)</w:t>
-      </w:r>
-    </w:p>
+          <w:b/>
+          <w:bCs/>
+          <w:sz w:val="24"/>
+          <w:szCs w:val="24"/>
+          <w:rtl/>
+        </w:rPr>
+      </w:pPr>
+    </w:p>
+    <w:sectPr>
+      <w:headerReference w:type="default" r:id="rId7"/>
+      <w:footerReference w:type="default" r:id="rId8"/>
+      <w:pgSz w:w="11907" w:h="16839" w:code="9"/>
+      <w:pgMar w:top="1440" w:right="1440" w:bottom="1440" w:left="1440" w:header="708" w:footer="708" w:gutter="0"/>
+      <w:cols w:space="708"/>
+      <w:docGrid w:linePitch="360"/>
+    </w:sectPr>
   </w:body>
 </w:document>
 </file>
 
 <file path=word/endnotes.xml><?xml version="1.0" encoding="utf-8"?>
-<w:endnotes xmlns:wpc="http://schemas.microsoft.com/office/word/2010/wordprocessingCanvas" xmlns:mc="http://schemas.openxmlformats.org/markup-compatibility/2006" xmlns:o="urn:schemas-microsoft-com:office:office" xmlns:r="http://schemas.openxmlformats.org/officeDocument/2006/relationships" xmlns:m="http://schemas.openxmlformats.org/officeDocument/2006/math" xmlns:v="urn:schemas-microsoft-com:vml" xmlns:wp14="http://schemas.microsoft.com/office/word/2010/wordprocessingDrawing" xmlns:wp="http://schemas.openxmlformats.org/drawingml/2006/wordprocessingDrawing" xmlns:w10="urn:schemas-microsoft-com:office:word" xmlns:w="http://schemas.openxmlformats.org/wordprocessingml/2006/main" xmlns:w14="http://schemas.microsoft.com/office/word/2010/wordml" xmlns:w15="http://schemas.microsoft.com/office/word/2012/wordml" xmlns:wpg="http://schemas.microsoft.com/office/word/2010/wordprocessingGroup" xmlns:wpi="http://schemas.microsoft.com/office/word/2010/wordprocessingInk" xmlns:wne="http://schemas.microsoft.com/office/word/2006/wordml" xmlns:wps="http://schemas.microsoft.com/office/word/2010/wordprocessingShape" mc:Ignorable="w14 w15 wp14">
+<w:endnotes xmlns:wpc="http://schemas.microsoft.com/office/word/2010/wordprocessingCanvas" xmlns:cx="http://schemas.microsoft.com/office/drawing/2014/chartex" xmlns:cx1="http://schemas.microsoft.com/office/drawing/2015/9/8/chartex" xmlns:cx2="http://schemas.microsoft.com/office/drawing/2015/10/21/chartex" xmlns:cx3="http://schemas.microsoft.com/office/drawing/2016/5/9/chartex" xmlns:cx4="http://schemas.microsoft.com/office/drawing/2016/5/10/chartex" xmlns:cx5="http://schemas.microsoft.com/office/drawing/2016/5/11/chartex" xmlns:cx6="http://schemas.microsoft.com/office/drawing/2016/5/12/chartex" xmlns:cx7="http://schemas.microsoft.com/office/drawing/2016/5/13/chartex" xmlns:cx8="http://schemas.microsoft.com/office/drawing/2016/5/14/chartex" xmlns:mc="http://schemas.openxmlformats.org/markup-compatibility/2006" xmlns:aink="http://schemas.microsoft.com/office/drawing/2016/ink" xmlns:am3d="http://schemas.microsoft.com/office/drawing/2017/model3d" xmlns:o="urn:schemas-microsoft-com:office:office" xmlns:oel="http://schemas.microsoft.com/office/2019/extlst" xmlns:r="http://schemas.openxmlformats.org/officeDocument/2006/relationships" xmlns:m="http://schemas.openxmlformats.org/officeDocument/2006/math" xmlns:v="urn:schemas-microsoft-com:vml" xmlns:wp14="http://schemas.microsoft.com/office/word/2010/wordprocessingDrawing" xmlns:wp="http://schemas.openxmlformats.org/drawingml/2006/wordprocessingDrawing" xmlns:w10="urn:schemas-microsoft-com:office:word" xmlns:w="http://schemas.openxmlformats.org/wordprocessingml/2006/main" xmlns:w14="http://schemas.microsoft.com/office/word/2010/wordml" xmlns:w15="http://schemas.microsoft.com/office/word/2012/wordml" xmlns:w16cex="http://schemas.microsoft.com/office/word/2018/wordml/cex" xmlns:w16cid="http://schemas.microsoft.com/office/word/2016/wordml/cid" xmlns:w16="http://schemas.microsoft.com/office/word/2018/wordml" xmlns:w16du="http://schemas.microsoft.com/office/word/2023/wordml/word16du" xmlns:w16sdtdh="http://schemas.microsoft.com/office/word/2020/wordml/sdtdatahash" xmlns:w16sdtfl="http://schemas.microsoft.com/office/word/2024/wordml/sdtformatlock" xmlns:w16se="http://schemas.microsoft.com/office/word/2015/wordml/symex" xmlns:wpg="http://schemas.microsoft.com/office/word/2010/wordprocessingGroup" xmlns:wpi="http://schemas.microsoft.com/office/word/2010/wordprocessingInk" xmlns:wne="http://schemas.microsoft.com/office/word/2006/wordml" xmlns:wps="http://schemas.microsoft.com/office/word/2010/wordprocessingShape" mc:Ignorable="w14 w15 w16se w16cid w16 w16cex w16sdtdh w16sdtfl w16du wp14">
   <w:endnote w:type="separator" w:id="-1">
     <w:p>
       <w:pPr>
@@ -2787,7 +2844,7 @@
 </file>
 
 <file path=word/footer1.xml><?xml version="1.0" encoding="utf-8"?>
-<w:ftr xmlns:wpc="http://schemas.microsoft.com/office/word/2010/wordprocessingCanvas" xmlns:mc="http://schemas.openxmlformats.org/markup-compatibility/2006" xmlns:o="urn:schemas-microsoft-com:office:office" xmlns:r="http://schemas.openxmlformats.org/officeDocument/2006/relationships" xmlns:m="http://schemas.openxmlformats.org/officeDocument/2006/math" xmlns:v="urn:schemas-microsoft-com:vml" xmlns:wp14="http://schemas.microsoft.com/office/word/2010/wordprocessingDrawing" xmlns:wp="http://schemas.openxmlformats.org/drawingml/2006/wordprocessingDrawing" xmlns:w10="urn:schemas-microsoft-com:office:word" xmlns:w="http://schemas.openxmlformats.org/wordprocessingml/2006/main" xmlns:w14="http://schemas.microsoft.com/office/word/2010/wordml" xmlns:w15="http://schemas.microsoft.com/office/word/2012/wordml" xmlns:wpg="http://schemas.microsoft.com/office/word/2010/wordprocessingGroup" xmlns:wpi="http://schemas.microsoft.com/office/word/2010/wordprocessingInk" xmlns:wne="http://schemas.microsoft.com/office/word/2006/wordml" xmlns:wps="http://schemas.microsoft.com/office/word/2010/wordprocessingShape" mc:Ignorable="w14 w15 wp14">
+<w:ftr xmlns:wpc="http://schemas.microsoft.com/office/word/2010/wordprocessingCanvas" xmlns:cx="http://schemas.microsoft.com/office/drawing/2014/chartex" xmlns:cx1="http://schemas.microsoft.com/office/drawing/2015/9/8/chartex" xmlns:cx2="http://schemas.microsoft.com/office/drawing/2015/10/21/chartex" xmlns:cx3="http://schemas.microsoft.com/office/drawing/2016/5/9/chartex" xmlns:cx4="http://schemas.microsoft.com/office/drawing/2016/5/10/chartex" xmlns:cx5="http://schemas.microsoft.com/office/drawing/2016/5/11/chartex" xmlns:cx6="http://schemas.microsoft.com/office/drawing/2016/5/12/chartex" xmlns:cx7="http://schemas.microsoft.com/office/drawing/2016/5/13/chartex" xmlns:cx8="http://schemas.microsoft.com/office/drawing/2016/5/14/chartex" xmlns:mc="http://schemas.openxmlformats.org/markup-compatibility/2006" xmlns:aink="http://schemas.microsoft.com/office/drawing/2016/ink" xmlns:am3d="http://schemas.microsoft.com/office/drawing/2017/model3d" xmlns:o="urn:schemas-microsoft-com:office:office" xmlns:oel="http://schemas.microsoft.com/office/2019/extlst" xmlns:r="http://schemas.openxmlformats.org/officeDocument/2006/relationships" xmlns:m="http://schemas.openxmlformats.org/officeDocument/2006/math" xmlns:v="urn:schemas-microsoft-com:vml" xmlns:wp14="http://schemas.microsoft.com/office/word/2010/wordprocessingDrawing" xmlns:wp="http://schemas.openxmlformats.org/drawingml/2006/wordprocessingDrawing" xmlns:w10="urn:schemas-microsoft-com:office:word" xmlns:w="http://schemas.openxmlformats.org/wordprocessingml/2006/main" xmlns:w14="http://schemas.microsoft.com/office/word/2010/wordml" xmlns:w15="http://schemas.microsoft.com/office/word/2012/wordml" xmlns:w16cex="http://schemas.microsoft.com/office/word/2018/wordml/cex" xmlns:w16cid="http://schemas.microsoft.com/office/word/2016/wordml/cid" xmlns:w16="http://schemas.microsoft.com/office/word/2018/wordml" xmlns:w16du="http://schemas.microsoft.com/office/word/2023/wordml/word16du" xmlns:w16sdtdh="http://schemas.microsoft.com/office/word/2020/wordml/sdtdatahash" xmlns:w16sdtfl="http://schemas.microsoft.com/office/word/2024/wordml/sdtformatlock" xmlns:w16se="http://schemas.microsoft.com/office/word/2015/wordml/symex" xmlns:wpg="http://schemas.microsoft.com/office/word/2010/wordprocessingGroup" xmlns:wpi="http://schemas.microsoft.com/office/word/2010/wordprocessingInk" xmlns:wne="http://schemas.microsoft.com/office/word/2006/wordml" xmlns:wps="http://schemas.microsoft.com/office/word/2010/wordprocessingShape" mc:Ignorable="w14 w15 w16se w16cid w16 w16cex w16sdtdh w16sdtfl w16du wp14">
   <w:p>
     <w:pPr>
       <w:pStyle w:val="a5"/>
@@ -2797,7 +2854,7 @@
         <w:noProof/>
       </w:rPr>
       <w:drawing>
-        <wp:anchor distT="0" distB="0" distL="114300" distR="114300" simplePos="0" relativeHeight="251659264" behindDoc="0" locked="0" layoutInCell="1" allowOverlap="1">
+        <wp:anchor distT="0" distB="0" distL="114300" distR="114300" simplePos="0" relativeHeight="251659264" behindDoc="0" locked="0" layoutInCell="1" allowOverlap="1" wp14:anchorId="30B6FE2F" wp14:editId="30B6FE30">
           <wp:simplePos x="0" y="0"/>
           <wp:positionH relativeFrom="margin">
             <wp:posOffset>-913765</wp:posOffset>
@@ -2845,7 +2902,7 @@
 </file>
 
 <file path=word/footnotes.xml><?xml version="1.0" encoding="utf-8"?>
-<w:footnotes xmlns:wpc="http://schemas.microsoft.com/office/word/2010/wordprocessingCanvas" xmlns:mc="http://schemas.openxmlformats.org/markup-compatibility/2006" xmlns:o="urn:schemas-microsoft-com:office:office" xmlns:r="http://schemas.openxmlformats.org/officeDocument/2006/relationships" xmlns:m="http://schemas.openxmlformats.org/officeDocument/2006/math" xmlns:v="urn:schemas-microsoft-com:vml" xmlns:wp14="http://schemas.microsoft.com/office/word/2010/wordprocessingDrawing" xmlns:wp="http://schemas.openxmlformats.org/drawingml/2006/wordprocessingDrawing" xmlns:w10="urn:schemas-microsoft-com:office:word" xmlns:w="http://schemas.openxmlformats.org/wordprocessingml/2006/main" xmlns:w14="http://schemas.microsoft.com/office/word/2010/wordml" xmlns:w15="http://schemas.microsoft.com/office/word/2012/wordml" xmlns:wpg="http://schemas.microsoft.com/office/word/2010/wordprocessingGroup" xmlns:wpi="http://schemas.microsoft.com/office/word/2010/wordprocessingInk" xmlns:wne="http://schemas.microsoft.com/office/word/2006/wordml" xmlns:wps="http://schemas.microsoft.com/office/word/2010/wordprocessingShape" mc:Ignorable="w14 w15 wp14">
+<w:footnotes xmlns:wpc="http://schemas.microsoft.com/office/word/2010/wordprocessingCanvas" xmlns:cx="http://schemas.microsoft.com/office/drawing/2014/chartex" xmlns:cx1="http://schemas.microsoft.com/office/drawing/2015/9/8/chartex" xmlns:cx2="http://schemas.microsoft.com/office/drawing/2015/10/21/chartex" xmlns:cx3="http://schemas.microsoft.com/office/drawing/2016/5/9/chartex" xmlns:cx4="http://schemas.microsoft.com/office/drawing/2016/5/10/chartex" xmlns:cx5="http://schemas.microsoft.com/office/drawing/2016/5/11/chartex" xmlns:cx6="http://schemas.microsoft.com/office/drawing/2016/5/12/chartex" xmlns:cx7="http://schemas.microsoft.com/office/drawing/2016/5/13/chartex" xmlns:cx8="http://schemas.microsoft.com/office/drawing/2016/5/14/chartex" xmlns:mc="http://schemas.openxmlformats.org/markup-compatibility/2006" xmlns:aink="http://schemas.microsoft.com/office/drawing/2016/ink" xmlns:am3d="http://schemas.microsoft.com/office/drawing/2017/model3d" xmlns:o="urn:schemas-microsoft-com:office:office" xmlns:oel="http://schemas.microsoft.com/office/2019/extlst" xmlns:r="http://schemas.openxmlformats.org/officeDocument/2006/relationships" xmlns:m="http://schemas.openxmlformats.org/officeDocument/2006/math" xmlns:v="urn:schemas-microsoft-com:vml" xmlns:wp14="http://schemas.microsoft.com/office/word/2010/wordprocessingDrawing" xmlns:wp="http://schemas.openxmlformats.org/drawingml/2006/wordprocessingDrawing" xmlns:w10="urn:schemas-microsoft-com:office:word" xmlns:w="http://schemas.openxmlformats.org/wordprocessingml/2006/main" xmlns:w14="http://schemas.microsoft.com/office/word/2010/wordml" xmlns:w15="http://schemas.microsoft.com/office/word/2012/wordml" xmlns:w16cex="http://schemas.microsoft.com/office/word/2018/wordml/cex" xmlns:w16cid="http://schemas.microsoft.com/office/word/2016/wordml/cid" xmlns:w16="http://schemas.microsoft.com/office/word/2018/wordml" xmlns:w16du="http://schemas.microsoft.com/office/word/2023/wordml/word16du" xmlns:w16sdtdh="http://schemas.microsoft.com/office/word/2020/wordml/sdtdatahash" xmlns:w16sdtfl="http://schemas.microsoft.com/office/word/2024/wordml/sdtformatlock" xmlns:w16se="http://schemas.microsoft.com/office/word/2015/wordml/symex" xmlns:wpg="http://schemas.microsoft.com/office/word/2010/wordprocessingGroup" xmlns:wpi="http://schemas.microsoft.com/office/word/2010/wordprocessingInk" xmlns:wne="http://schemas.microsoft.com/office/word/2006/wordml" xmlns:wps="http://schemas.microsoft.com/office/word/2010/wordprocessingShape" mc:Ignorable="w14 w15 w16se w16cid w16 w16cex w16sdtdh w16sdtfl w16du wp14">
   <w:footnote w:type="separator" w:id="-1">
     <w:p>
       <w:pPr>
@@ -2870,7 +2927,7 @@
 </file>
 
 <file path=word/header1.xml><?xml version="1.0" encoding="utf-8"?>
-<w:hdr xmlns:wpc="http://schemas.microsoft.com/office/word/2010/wordprocessingCanvas" xmlns:mc="http://schemas.openxmlformats.org/markup-compatibility/2006" xmlns:o="urn:schemas-microsoft-com:office:office" xmlns:r="http://schemas.openxmlformats.org/officeDocument/2006/relationships" xmlns:m="http://schemas.openxmlformats.org/officeDocument/2006/math" xmlns:v="urn:schemas-microsoft-com:vml" xmlns:wp14="http://schemas.microsoft.com/office/word/2010/wordprocessingDrawing" xmlns:wp="http://schemas.openxmlformats.org/drawingml/2006/wordprocessingDrawing" xmlns:w10="urn:schemas-microsoft-com:office:word" xmlns:w="http://schemas.openxmlformats.org/wordprocessingml/2006/main" xmlns:w14="http://schemas.microsoft.com/office/word/2010/wordml" xmlns:w15="http://schemas.microsoft.com/office/word/2012/wordml" xmlns:wpg="http://schemas.microsoft.com/office/word/2010/wordprocessingGroup" xmlns:wpi="http://schemas.microsoft.com/office/word/2010/wordprocessingInk" xmlns:wne="http://schemas.microsoft.com/office/word/2006/wordml" xmlns:wps="http://schemas.microsoft.com/office/word/2010/wordprocessingShape" mc:Ignorable="w14 w15 wp14">
+<w:hdr xmlns:wpc="http://schemas.microsoft.com/office/word/2010/wordprocessingCanvas" xmlns:cx="http://schemas.microsoft.com/office/drawing/2014/chartex" xmlns:cx1="http://schemas.microsoft.com/office/drawing/2015/9/8/chartex" xmlns:cx2="http://schemas.microsoft.com/office/drawing/2015/10/21/chartex" xmlns:cx3="http://schemas.microsoft.com/office/drawing/2016/5/9/chartex" xmlns:cx4="http://schemas.microsoft.com/office/drawing/2016/5/10/chartex" xmlns:cx5="http://schemas.microsoft.com/office/drawing/2016/5/11/chartex" xmlns:cx6="http://schemas.microsoft.com/office/drawing/2016/5/12/chartex" xmlns:cx7="http://schemas.microsoft.com/office/drawing/2016/5/13/chartex" xmlns:cx8="http://schemas.microsoft.com/office/drawing/2016/5/14/chartex" xmlns:mc="http://schemas.openxmlformats.org/markup-compatibility/2006" xmlns:aink="http://schemas.microsoft.com/office/drawing/2016/ink" xmlns:am3d="http://schemas.microsoft.com/office/drawing/2017/model3d" xmlns:o="urn:schemas-microsoft-com:office:office" xmlns:oel="http://schemas.microsoft.com/office/2019/extlst" xmlns:r="http://schemas.openxmlformats.org/officeDocument/2006/relationships" xmlns:m="http://schemas.openxmlformats.org/officeDocument/2006/math" xmlns:v="urn:schemas-microsoft-com:vml" xmlns:wp14="http://schemas.microsoft.com/office/word/2010/wordprocessingDrawing" xmlns:wp="http://schemas.openxmlformats.org/drawingml/2006/wordprocessingDrawing" xmlns:w10="urn:schemas-microsoft-com:office:word" xmlns:w="http://schemas.openxmlformats.org/wordprocessingml/2006/main" xmlns:w14="http://schemas.microsoft.com/office/word/2010/wordml" xmlns:w15="http://schemas.microsoft.com/office/word/2012/wordml" xmlns:w16cex="http://schemas.microsoft.com/office/word/2018/wordml/cex" xmlns:w16cid="http://schemas.microsoft.com/office/word/2016/wordml/cid" xmlns:w16="http://schemas.microsoft.com/office/word/2018/wordml" xmlns:w16du="http://schemas.microsoft.com/office/word/2023/wordml/word16du" xmlns:w16sdtdh="http://schemas.microsoft.com/office/word/2020/wordml/sdtdatahash" xmlns:w16sdtfl="http://schemas.microsoft.com/office/word/2024/wordml/sdtformatlock" xmlns:w16se="http://schemas.microsoft.com/office/word/2015/wordml/symex" xmlns:wpg="http://schemas.microsoft.com/office/word/2010/wordprocessingGroup" xmlns:wpi="http://schemas.microsoft.com/office/word/2010/wordprocessingInk" xmlns:wne="http://schemas.microsoft.com/office/word/2006/wordml" xmlns:wps="http://schemas.microsoft.com/office/word/2010/wordprocessingShape" mc:Ignorable="w14 w15 w16se w16cid w16 w16cex w16sdtdh w16sdtfl w16du wp14">
   <w:p>
     <w:pPr>
       <w:pStyle w:val="a3"/>
@@ -2887,7 +2944,7 @@
         <w:noProof/>
       </w:rPr>
       <w:drawing>
-        <wp:anchor distT="0" distB="0" distL="114300" distR="114300" simplePos="0" relativeHeight="251658240" behindDoc="1" locked="0" layoutInCell="1" allowOverlap="1">
+        <wp:anchor distT="0" distB="0" distL="114300" distR="114300" simplePos="0" relativeHeight="251658240" behindDoc="1" locked="0" layoutInCell="1" allowOverlap="1" wp14:anchorId="30B6FE2D" wp14:editId="30B6FE2E">
           <wp:simplePos x="0" y="0"/>
           <wp:positionH relativeFrom="margin">
             <wp:align>center</wp:align>
@@ -2944,7 +3001,7 @@
 </file>
 
 <file path=word/numbering.xml><?xml version="1.0" encoding="utf-8"?>
-<w:numbering xmlns:wpc="http://schemas.microsoft.com/office/word/2010/wordprocessingCanvas" xmlns:mc="http://schemas.openxmlformats.org/markup-compatibility/2006" xmlns:o="urn:schemas-microsoft-com:office:office" xmlns:r="http://schemas.openxmlformats.org/officeDocument/2006/relationships" xmlns:m="http://schemas.openxmlformats.org/officeDocument/2006/math" xmlns:v="urn:schemas-microsoft-com:vml" xmlns:wp14="http://schemas.microsoft.com/office/word/2010/wordprocessingDrawing" xmlns:wp="http://schemas.openxmlformats.org/drawingml/2006/wordprocessingDrawing" xmlns:w10="urn:schemas-microsoft-com:office:word" xmlns:w="http://schemas.openxmlformats.org/wordprocessingml/2006/main" xmlns:w14="http://schemas.microsoft.com/office/word/2010/wordml" xmlns:w15="http://schemas.microsoft.com/office/word/2012/wordml" xmlns:wpg="http://schemas.microsoft.com/office/word/2010/wordprocessingGroup" xmlns:wpi="http://schemas.microsoft.com/office/word/2010/wordprocessingInk" xmlns:wne="http://schemas.microsoft.com/office/word/2006/wordml" xmlns:wps="http://schemas.microsoft.com/office/word/2010/wordprocessingShape" mc:Ignorable="w14 w15 wp14">
+<w:numbering xmlns:wpc="http://schemas.microsoft.com/office/word/2010/wordprocessingCanvas" xmlns:cx="http://schemas.microsoft.com/office/drawing/2014/chartex" xmlns:cx1="http://schemas.microsoft.com/office/drawing/2015/9/8/chartex" xmlns:cx2="http://schemas.microsoft.com/office/drawing/2015/10/21/chartex" xmlns:cx3="http://schemas.microsoft.com/office/drawing/2016/5/9/chartex" xmlns:cx4="http://schemas.microsoft.com/office/drawing/2016/5/10/chartex" xmlns:cx5="http://schemas.microsoft.com/office/drawing/2016/5/11/chartex" xmlns:cx6="http://schemas.microsoft.com/office/drawing/2016/5/12/chartex" xmlns:cx7="http://schemas.microsoft.com/office/drawing/2016/5/13/chartex" xmlns:cx8="http://schemas.microsoft.com/office/drawing/2016/5/14/chartex" xmlns:mc="http://schemas.openxmlformats.org/markup-compatibility/2006" xmlns:aink="http://schemas.microsoft.com/office/drawing/2016/ink" xmlns:am3d="http://schemas.microsoft.com/office/drawing/2017/model3d" xmlns:o="urn:schemas-microsoft-com:office:office" xmlns:oel="http://schemas.microsoft.com/office/2019/extlst" xmlns:r="http://schemas.openxmlformats.org/officeDocument/2006/relationships" xmlns:m="http://schemas.openxmlformats.org/officeDocument/2006/math" xmlns:v="urn:schemas-microsoft-com:vml" xmlns:wp14="http://schemas.microsoft.com/office/word/2010/wordprocessingDrawing" xmlns:wp="http://schemas.openxmlformats.org/drawingml/2006/wordprocessingDrawing" xmlns:w10="urn:schemas-microsoft-com:office:word" xmlns:w="http://schemas.openxmlformats.org/wordprocessingml/2006/main" xmlns:w14="http://schemas.microsoft.com/office/word/2010/wordml" xmlns:w15="http://schemas.microsoft.com/office/word/2012/wordml" xmlns:w16cex="http://schemas.microsoft.com/office/word/2018/wordml/cex" xmlns:w16cid="http://schemas.microsoft.com/office/word/2016/wordml/cid" xmlns:w16="http://schemas.microsoft.com/office/word/2018/wordml" xmlns:w16du="http://schemas.microsoft.com/office/word/2023/wordml/word16du" xmlns:w16sdtdh="http://schemas.microsoft.com/office/word/2020/wordml/sdtdatahash" xmlns:w16sdtfl="http://schemas.microsoft.com/office/word/2024/wordml/sdtformatlock" xmlns:w16se="http://schemas.microsoft.com/office/word/2015/wordml/symex" xmlns:wpg="http://schemas.microsoft.com/office/word/2010/wordprocessingGroup" xmlns:wpi="http://schemas.microsoft.com/office/word/2010/wordprocessingInk" xmlns:wne="http://schemas.microsoft.com/office/word/2006/wordml" xmlns:wps="http://schemas.microsoft.com/office/word/2010/wordprocessingShape" mc:Ignorable="w14 w15 w16se w16cid w16 w16cex w16sdtdh w16sdtfl w16du wp14">
   <w:abstractNum w:abstractNumId="0" w15:restartNumberingAfterBreak="0">
     <w:nsid w:val="10F07BC9"/>
     <w:multiLevelType w:val="hybridMultilevel"/>
@@ -3493,29 +3550,29 @@
       </w:pPr>
     </w:lvl>
   </w:abstractNum>
-  <w:num w:numId="1">
+  <w:num w:numId="1" w16cid:durableId="1958023325">
     <w:abstractNumId w:val="2"/>
   </w:num>
-  <w:num w:numId="2">
+  <w:num w:numId="2" w16cid:durableId="266818473">
     <w:abstractNumId w:val="1"/>
   </w:num>
-  <w:num w:numId="3">
+  <w:num w:numId="3" w16cid:durableId="648174450">
     <w:abstractNumId w:val="5"/>
   </w:num>
-  <w:num w:numId="4">
+  <w:num w:numId="4" w16cid:durableId="1168517719">
     <w:abstractNumId w:val="4"/>
   </w:num>
-  <w:num w:numId="5">
+  <w:num w:numId="5" w16cid:durableId="634989655">
     <w:abstractNumId w:val="3"/>
   </w:num>
-  <w:num w:numId="6">
+  <w:num w:numId="6" w16cid:durableId="416563676">
     <w:abstractNumId w:val="0"/>
   </w:num>
 </w:numbering>
 </file>
 
 <file path=word/styles.xml><?xml version="1.0" encoding="utf-8"?>
-<w:styles xmlns:mc="http://schemas.openxmlformats.org/markup-compatibility/2006" xmlns:r="http://schemas.openxmlformats.org/officeDocument/2006/relationships" xmlns:w="http://schemas.openxmlformats.org/wordprocessingml/2006/main" xmlns:w14="http://schemas.microsoft.com/office/word/2010/wordml" xmlns:w15="http://schemas.microsoft.com/office/word/2012/wordml" mc:Ignorable="w14 w15">
+<w:styles xmlns:mc="http://schemas.openxmlformats.org/markup-compatibility/2006" xmlns:r="http://schemas.openxmlformats.org/officeDocument/2006/relationships" xmlns:w="http://schemas.openxmlformats.org/wordprocessingml/2006/main" xmlns:w14="http://schemas.microsoft.com/office/word/2010/wordml" xmlns:w15="http://schemas.microsoft.com/office/word/2012/wordml" xmlns:w16cex="http://schemas.microsoft.com/office/word/2018/wordml/cex" xmlns:w16cid="http://schemas.microsoft.com/office/word/2016/wordml/cid" xmlns:w16="http://schemas.microsoft.com/office/word/2018/wordml" xmlns:w16du="http://schemas.microsoft.com/office/word/2023/wordml/word16du" xmlns:w16sdtdh="http://schemas.microsoft.com/office/word/2020/wordml/sdtdatahash" xmlns:w16sdtfl="http://schemas.microsoft.com/office/word/2024/wordml/sdtformatlock" xmlns:w16se="http://schemas.microsoft.com/office/word/2015/wordml/symex" mc:Ignorable="w14 w15 w16se w16cid w16 w16cex w16sdtdh w16sdtfl w16du">
   <w:docDefaults>
     <w:rPrDefault>
       <w:rPr>
@@ -3531,7 +3588,7 @@
       </w:pPr>
     </w:pPrDefault>
   </w:docDefaults>
-  <w:latentStyles w:defLockedState="0" w:defUIPriority="99" w:defSemiHidden="0" w:defUnhideWhenUsed="0" w:defQFormat="0" w:count="371">
+  <w:latentStyles w:defLockedState="0" w:defUIPriority="99" w:defSemiHidden="0" w:defUnhideWhenUsed="0" w:defQFormat="0" w:count="376">
     <w:lsdException w:name="Normal" w:uiPriority="0" w:qFormat="1"/>
     <w:lsdException w:name="heading 1" w:uiPriority="9" w:qFormat="1"/>
     <w:lsdException w:name="heading 2" w:semiHidden="1" w:uiPriority="9" w:unhideWhenUsed="1" w:qFormat="1"/>
@@ -3903,6 +3960,11 @@
     <w:lsdException w:name="List Table 5 Dark Accent 6" w:uiPriority="50"/>
     <w:lsdException w:name="List Table 6 Colorful Accent 6" w:uiPriority="51"/>
     <w:lsdException w:name="List Table 7 Colorful Accent 6" w:uiPriority="52"/>
+    <w:lsdException w:name="Mention" w:semiHidden="1" w:unhideWhenUsed="1"/>
+    <w:lsdException w:name="Smart Hyperlink" w:semiHidden="1" w:unhideWhenUsed="1"/>
+    <w:lsdException w:name="Hashtag" w:semiHidden="1" w:unhideWhenUsed="1"/>
+    <w:lsdException w:name="Unresolved Mention" w:semiHidden="1" w:unhideWhenUsed="1"/>
+    <w:lsdException w:name="Smart Link" w:semiHidden="1" w:unhideWhenUsed="1"/>
   </w:latentStyles>
   <w:style w:type="paragraph" w:default="1" w:styleId="a">
     <w:name w:val="Normal"/>

</xml_diff>